<commit_message>
sigo con cambios en Reporte de ventas de Joyeria por los cambios pedidos por Rocío
</commit_message>
<xml_diff>
--- a/Cambios a Reportes.docx
+++ b/Cambios a Reportes.docx
@@ -1,6 +1,6 @@
 
 <file path=word/document.xml><?xml version="1.0" encoding="utf-8"?>
-<w:document xmlns:wpc="http://schemas.microsoft.com/office/word/2010/wordprocessingCanvas" xmlns:cx="http://schemas.microsoft.com/office/drawing/2014/chartex" xmlns:mc="http://schemas.openxmlformats.org/markup-compatibility/2006" xmlns:o="urn:schemas-microsoft-com:office:office" xmlns:r="http://schemas.openxmlformats.org/officeDocument/2006/relationships" xmlns:m="http://schemas.openxmlformats.org/officeDocument/2006/math" xmlns:v="urn:schemas-microsoft-com:vml" xmlns:wp14="http://schemas.microsoft.com/office/word/2010/wordprocessingDrawing" xmlns:wp="http://schemas.openxmlformats.org/drawingml/2006/wordprocessingDrawing" xmlns:w10="urn:schemas-microsoft-com:office:word" xmlns:w="http://schemas.openxmlformats.org/wordprocessingml/2006/main" xmlns:w14="http://schemas.microsoft.com/office/word/2010/wordml" xmlns:w15="http://schemas.microsoft.com/office/word/2012/wordml" xmlns:w16se="http://schemas.microsoft.com/office/word/2015/wordml/symex" xmlns:wpg="http://schemas.microsoft.com/office/word/2010/wordprocessingGroup" xmlns:wpi="http://schemas.microsoft.com/office/word/2010/wordprocessingInk" xmlns:wne="http://schemas.microsoft.com/office/word/2006/wordml" xmlns:wps="http://schemas.microsoft.com/office/word/2010/wordprocessingShape" mc:Ignorable="w14 w15 w16se wp14">
+<w:document xmlns:wpc="http://schemas.microsoft.com/office/word/2010/wordprocessingCanvas" xmlns:cx="http://schemas.microsoft.com/office/drawing/2014/chartex" xmlns:cx1="http://schemas.microsoft.com/office/drawing/2015/9/8/chartex" xmlns:mc="http://schemas.openxmlformats.org/markup-compatibility/2006" xmlns:o="urn:schemas-microsoft-com:office:office" xmlns:r="http://schemas.openxmlformats.org/officeDocument/2006/relationships" xmlns:m="http://schemas.openxmlformats.org/officeDocument/2006/math" xmlns:v="urn:schemas-microsoft-com:vml" xmlns:wp14="http://schemas.microsoft.com/office/word/2010/wordprocessingDrawing" xmlns:wp="http://schemas.openxmlformats.org/drawingml/2006/wordprocessingDrawing" xmlns:w10="urn:schemas-microsoft-com:office:word" xmlns:w="http://schemas.openxmlformats.org/wordprocessingml/2006/main" xmlns:w14="http://schemas.microsoft.com/office/word/2010/wordml" xmlns:w15="http://schemas.microsoft.com/office/word/2012/wordml" xmlns:w16se="http://schemas.microsoft.com/office/word/2015/wordml/symex" xmlns:wpg="http://schemas.microsoft.com/office/word/2010/wordprocessingGroup" xmlns:wpi="http://schemas.microsoft.com/office/word/2010/wordprocessingInk" xmlns:wne="http://schemas.microsoft.com/office/word/2006/wordml" xmlns:wps="http://schemas.microsoft.com/office/word/2010/wordprocessingShape" mc:Ignorable="w14 w15 w16se wp14">
   <w:body>
     <w:p>
       <w:pPr>
@@ -17,17 +17,19 @@
         </w:rPr>
         <w:t>Reporte ventas Joyería</w:t>
       </w:r>
+    </w:p>
+    <w:p>
+      <w:pPr>
+        <w:rPr>
+          <w:highlight w:val="green"/>
+          <w:lang w:val="es-MX"/>
+        </w:rPr>
+      </w:pPr>
       <w:bookmarkStart w:id="0" w:name="_GoBack"/>
       <w:bookmarkEnd w:id="0"/>
-    </w:p>
-    <w:p>
-      <w:pPr>
-        <w:rPr>
-          <w:lang w:val="es-MX"/>
-        </w:rPr>
-      </w:pPr>
-      <w:r>
-        <w:rPr>
+      <w:r>
+        <w:rPr>
+          <w:highlight w:val="green"/>
           <w:lang w:val="es-MX"/>
         </w:rPr>
         <w:t>Cambiar SUBFAMILIA x FAMILIA</w:t>
@@ -41,6 +43,7 @@
       </w:pPr>
       <w:r>
         <w:rPr>
+          <w:highlight w:val="green"/>
           <w:lang w:val="es-MX"/>
         </w:rPr>
         <w:t>Eliminar fila de descuento</w:t>
@@ -54,6 +57,7 @@
       </w:pPr>
       <w:r>
         <w:rPr>
+          <w:highlight w:val="green"/>
           <w:lang w:val="es-MX"/>
         </w:rPr>
         <w:t xml:space="preserve">En hojas SKU y Familia: concatenar las columnas COLOR, TALLE, MEDIDA, </w:t>
@@ -61,6 +65,7 @@
       <w:proofErr w:type="spellStart"/>
       <w:r>
         <w:rPr>
+          <w:highlight w:val="green"/>
           <w:lang w:val="es-MX"/>
         </w:rPr>
         <w:t>etc</w:t>
@@ -68,6 +73,7 @@
       <w:proofErr w:type="spellEnd"/>
       <w:r>
         <w:rPr>
+          <w:highlight w:val="green"/>
           <w:lang w:val="es-MX"/>
         </w:rPr>
         <w:t xml:space="preserve"> al nombre del producto</w:t>
@@ -76,11 +82,13 @@
     <w:p>
       <w:pPr>
         <w:rPr>
-          <w:lang w:val="es-MX"/>
-        </w:rPr>
-      </w:pPr>
-      <w:r>
-        <w:rPr>
+          <w:highlight w:val="green"/>
+          <w:lang w:val="es-MX"/>
+        </w:rPr>
+      </w:pPr>
+      <w:r>
+        <w:rPr>
+          <w:highlight w:val="green"/>
           <w:lang w:val="es-MX"/>
         </w:rPr>
         <w:t xml:space="preserve">En Atributos: agregar pulseras (talle y grosor). Pasar al final lo que es zodíaco, anillos dos letras, </w:t>
@@ -88,6 +96,7 @@
       <w:proofErr w:type="spellStart"/>
       <w:r>
         <w:rPr>
+          <w:highlight w:val="green"/>
           <w:lang w:val="es-MX"/>
         </w:rPr>
         <w:t>etc</w:t>
@@ -102,12 +111,14 @@
       </w:pPr>
       <w:r>
         <w:rPr>
+          <w:highlight w:val="green"/>
           <w:lang w:val="es-MX"/>
         </w:rPr>
         <w:t>En Nacionalidad</w:t>
       </w:r>
       <w:r>
         <w:rPr>
+          <w:highlight w:val="green"/>
           <w:lang w:val="es-MX"/>
         </w:rPr>
         <w:t>: agregar los % a la tabla</w:t>
@@ -121,6 +132,7 @@
       </w:pPr>
       <w:r>
         <w:rPr>
+          <w:highlight w:val="green"/>
           <w:lang w:val="es-MX"/>
         </w:rPr>
         <w:t>Precio unitario: redondear valores</w:t>

</xml_diff>

<commit_message>
Joyeria: agregue hoja con metodos de pago, imagenes a stock sin vnder, renombre subfamilias por familias y cambios menores. En descarga de imagenes actualice la contraseña
</commit_message>
<xml_diff>
--- a/Cambios a Reportes.docx
+++ b/Cambios a Reportes.docx
@@ -25,153 +25,397 @@
           <w:lang w:val="es-MX"/>
         </w:rPr>
       </w:pPr>
+      <w:r>
+        <w:rPr>
+          <w:highlight w:val="green"/>
+          <w:lang w:val="es-MX"/>
+        </w:rPr>
+        <w:t>Cambiar SUBFAMILIA x FAMILIA</w:t>
+      </w:r>
+    </w:p>
+    <w:p>
+      <w:pPr>
+        <w:rPr>
+          <w:lang w:val="es-MX"/>
+        </w:rPr>
+      </w:pPr>
+      <w:r>
+        <w:rPr>
+          <w:highlight w:val="green"/>
+          <w:lang w:val="es-MX"/>
+        </w:rPr>
+        <w:t>Eliminar fila de descuento</w:t>
+      </w:r>
+    </w:p>
+    <w:p>
+      <w:pPr>
+        <w:rPr>
+          <w:lang w:val="es-MX"/>
+        </w:rPr>
+      </w:pPr>
+      <w:r>
+        <w:rPr>
+          <w:highlight w:val="green"/>
+          <w:lang w:val="es-MX"/>
+        </w:rPr>
+        <w:t xml:space="preserve">En hojas SKU y Familia: concatenar las columnas COLOR, TALLE, MEDIDA, </w:t>
+      </w:r>
+      <w:proofErr w:type="spellStart"/>
+      <w:r>
+        <w:rPr>
+          <w:highlight w:val="green"/>
+          <w:lang w:val="es-MX"/>
+        </w:rPr>
+        <w:t>etc</w:t>
+      </w:r>
+      <w:proofErr w:type="spellEnd"/>
+      <w:r>
+        <w:rPr>
+          <w:highlight w:val="green"/>
+          <w:lang w:val="es-MX"/>
+        </w:rPr>
+        <w:t xml:space="preserve"> al nombre del producto</w:t>
+      </w:r>
+    </w:p>
+    <w:p>
+      <w:pPr>
+        <w:rPr>
+          <w:highlight w:val="green"/>
+          <w:lang w:val="es-MX"/>
+        </w:rPr>
+      </w:pPr>
+      <w:r>
+        <w:rPr>
+          <w:highlight w:val="green"/>
+          <w:lang w:val="es-MX"/>
+        </w:rPr>
+        <w:t xml:space="preserve">En Atributos: agregar pulseras (talle y grosor). Pasar al final lo que es zodíaco, anillos dos letras, </w:t>
+      </w:r>
+      <w:proofErr w:type="spellStart"/>
+      <w:r>
+        <w:rPr>
+          <w:highlight w:val="green"/>
+          <w:lang w:val="es-MX"/>
+        </w:rPr>
+        <w:t>etc</w:t>
+      </w:r>
+      <w:proofErr w:type="spellEnd"/>
+    </w:p>
+    <w:p>
+      <w:pPr>
+        <w:rPr>
+          <w:lang w:val="es-MX"/>
+        </w:rPr>
+      </w:pPr>
+      <w:r>
+        <w:rPr>
+          <w:highlight w:val="green"/>
+          <w:lang w:val="es-MX"/>
+        </w:rPr>
+        <w:t>En Nacionalidad</w:t>
+      </w:r>
+      <w:r>
+        <w:rPr>
+          <w:highlight w:val="green"/>
+          <w:lang w:val="es-MX"/>
+        </w:rPr>
+        <w:t>: agregar los % a la tabla</w:t>
+      </w:r>
+    </w:p>
+    <w:p>
+      <w:pPr>
+        <w:rPr>
+          <w:lang w:val="es-MX"/>
+        </w:rPr>
+      </w:pPr>
+      <w:r>
+        <w:rPr>
+          <w:highlight w:val="green"/>
+          <w:lang w:val="es-MX"/>
+        </w:rPr>
+        <w:t>Precio unitario: redondear valores</w:t>
+      </w:r>
+    </w:p>
+    <w:p>
+      <w:pPr>
+        <w:rPr>
+          <w:lang w:val="es-MX"/>
+        </w:rPr>
+      </w:pPr>
+      <w:r>
+        <w:rPr>
+          <w:lang w:val="es-MX"/>
+        </w:rPr>
+        <w:t xml:space="preserve">Agregar tabla de % ventas x medio de pago (ver si con </w:t>
+      </w:r>
+      <w:proofErr w:type="spellStart"/>
+      <w:r>
+        <w:rPr>
+          <w:lang w:val="es-MX"/>
+        </w:rPr>
+        <w:t>ODoo</w:t>
+      </w:r>
+      <w:proofErr w:type="spellEnd"/>
+      <w:r>
+        <w:rPr>
+          <w:lang w:val="es-MX"/>
+        </w:rPr>
+        <w:t xml:space="preserve"> o con </w:t>
+      </w:r>
+      <w:proofErr w:type="spellStart"/>
+      <w:r>
+        <w:rPr>
+          <w:lang w:val="es-MX"/>
+        </w:rPr>
+        <w:t>fiserv</w:t>
+      </w:r>
+      <w:proofErr w:type="spellEnd"/>
+      <w:r>
+        <w:rPr>
+          <w:lang w:val="es-MX"/>
+        </w:rPr>
+        <w:t>)</w:t>
+      </w:r>
+      <w:r>
+        <w:rPr>
+          <w:lang w:val="es-MX"/>
+        </w:rPr>
+        <w:t xml:space="preserve"> USAR LO DE SILVINA</w:t>
+      </w:r>
+    </w:p>
+    <w:p>
+      <w:pPr>
+        <w:rPr>
+          <w:lang w:val="es-MX"/>
+        </w:rPr>
+      </w:pPr>
+    </w:p>
+    <w:p>
+      <w:pPr>
+        <w:rPr>
+          <w:lang w:val="es-MX"/>
+        </w:rPr>
+      </w:pPr>
+    </w:p>
+    <w:p>
+      <w:pPr>
+        <w:rPr>
+          <w:b/>
+          <w:lang w:val="es-MX"/>
+        </w:rPr>
+      </w:pPr>
+      <w:r>
+        <w:rPr>
+          <w:b/>
+          <w:lang w:val="es-MX"/>
+        </w:rPr>
+        <w:t>DASHBOARD:</w:t>
+      </w:r>
+    </w:p>
+    <w:p>
+      <w:pPr>
+        <w:rPr>
+          <w:lang w:val="es-MX"/>
+        </w:rPr>
+      </w:pPr>
+      <w:r>
+        <w:rPr>
+          <w:lang w:val="es-MX"/>
+        </w:rPr>
+        <w:t xml:space="preserve">Voy a tener que usar los costos actualizados hacia atrás. Me va a avisar Rocío cuando lo tenga listo en </w:t>
+      </w:r>
+      <w:proofErr w:type="spellStart"/>
+      <w:r>
+        <w:rPr>
+          <w:lang w:val="es-MX"/>
+        </w:rPr>
+        <w:t>Odoo</w:t>
+      </w:r>
+      <w:proofErr w:type="spellEnd"/>
+    </w:p>
+    <w:p>
+      <w:pPr>
+        <w:rPr>
+          <w:lang w:val="es-MX"/>
+        </w:rPr>
+      </w:pPr>
+      <w:proofErr w:type="spellStart"/>
+      <w:r>
+        <w:rPr>
+          <w:lang w:val="es-MX"/>
+        </w:rPr>
+        <w:t>Pack</w:t>
+      </w:r>
+      <w:r>
+        <w:rPr>
+          <w:lang w:val="es-MX"/>
+        </w:rPr>
+        <w:t>aging</w:t>
+      </w:r>
+      <w:proofErr w:type="spellEnd"/>
+      <w:r>
+        <w:rPr>
+          <w:lang w:val="es-MX"/>
+        </w:rPr>
+        <w:t>: Ro va a ver con las chicas los remitos para poder hacer el cálculo con el inventario de Roxana</w:t>
+      </w:r>
+    </w:p>
+    <w:p>
+      <w:pPr>
+        <w:rPr>
+          <w:lang w:val="es-MX"/>
+        </w:rPr>
+      </w:pPr>
+      <w:r>
+        <w:rPr>
+          <w:lang w:val="es-MX"/>
+        </w:rPr>
+        <w:t>Servicios: cambiarle el nombre x Gastos extraordinarios y ver si puedo ponerle un comentario para que se sepa de qué se trata</w:t>
+      </w:r>
+    </w:p>
+    <w:p>
+      <w:pPr>
+        <w:rPr>
+          <w:lang w:val="es-MX"/>
+        </w:rPr>
+      </w:pPr>
+      <w:r>
+        <w:rPr>
+          <w:lang w:val="es-MX"/>
+        </w:rPr>
+        <w:t>Incentivo (sueldos)</w:t>
+      </w:r>
+      <w:r>
+        <w:rPr>
+          <w:lang w:val="es-MX"/>
+        </w:rPr>
+        <w:t>: llamarlo Premio x venta y una parte sale de los recibos de sueldo. La otra parte pedir a Silvina (</w:t>
+      </w:r>
+      <w:r>
+        <w:rPr>
+          <w:lang w:val="es-MX"/>
+        </w:rPr>
+        <w:t>lo que se paga por afuera a las encargadas, no supervisoras)</w:t>
+      </w:r>
+      <w:r>
+        <w:rPr>
+          <w:lang w:val="es-MX"/>
+        </w:rPr>
+        <w:t xml:space="preserve"> SUMAR ESTO AL </w:t>
+      </w:r>
+      <w:r>
+        <w:rPr>
+          <w:b/>
+          <w:lang w:val="es-MX"/>
+        </w:rPr>
+        <w:t>REPORTE DE GASTOS</w:t>
+      </w:r>
+      <w:r>
+        <w:rPr>
+          <w:lang w:val="es-MX"/>
+        </w:rPr>
+        <w:t xml:space="preserve"> (DISCRIMINANDO INCENTIVO DE SUELDO)</w:t>
+      </w:r>
+    </w:p>
+    <w:p>
+      <w:pPr>
+        <w:rPr>
+          <w:lang w:val="es-MX"/>
+        </w:rPr>
+      </w:pPr>
+      <w:r>
+        <w:rPr>
+          <w:highlight w:val="yellow"/>
+          <w:lang w:val="es-MX"/>
+        </w:rPr>
+        <w:t>Revisar los sueldos que ante = cantidad de horas dan más altos en abril</w:t>
+      </w:r>
+    </w:p>
+    <w:p>
+      <w:pPr>
+        <w:rPr>
+          <w:lang w:val="es-MX"/>
+        </w:rPr>
+      </w:pPr>
+      <w:r>
+        <w:rPr>
+          <w:lang w:val="es-MX"/>
+        </w:rPr>
+        <w:t>Eliminar el gasto del vidrio de AS San Telmo</w:t>
+      </w:r>
+    </w:p>
+    <w:p>
+      <w:pPr>
+        <w:rPr>
+          <w:lang w:val="es-MX"/>
+        </w:rPr>
+      </w:pPr>
       <w:bookmarkStart w:id="0" w:name="_GoBack"/>
       <w:bookmarkEnd w:id="0"/>
-      <w:r>
-        <w:rPr>
-          <w:highlight w:val="green"/>
-          <w:lang w:val="es-MX"/>
-        </w:rPr>
-        <w:t>Cambiar SUBFAMILIA x FAMILIA</w:t>
-      </w:r>
-    </w:p>
-    <w:p>
-      <w:pPr>
-        <w:rPr>
-          <w:lang w:val="es-MX"/>
-        </w:rPr>
-      </w:pPr>
-      <w:r>
-        <w:rPr>
-          <w:highlight w:val="green"/>
-          <w:lang w:val="es-MX"/>
-        </w:rPr>
-        <w:t>Eliminar fila de descuento</w:t>
-      </w:r>
-    </w:p>
-    <w:p>
-      <w:pPr>
-        <w:rPr>
-          <w:lang w:val="es-MX"/>
-        </w:rPr>
-      </w:pPr>
-      <w:r>
-        <w:rPr>
-          <w:highlight w:val="green"/>
-          <w:lang w:val="es-MX"/>
-        </w:rPr>
-        <w:t xml:space="preserve">En hojas SKU y Familia: concatenar las columnas COLOR, TALLE, MEDIDA, </w:t>
+    </w:p>
+    <w:p>
+      <w:pPr>
+        <w:rPr>
+          <w:lang w:val="es-MX"/>
+        </w:rPr>
+      </w:pPr>
+    </w:p>
+    <w:p>
+      <w:pPr>
+        <w:rPr>
+          <w:lang w:val="es-MX"/>
+        </w:rPr>
+      </w:pPr>
+    </w:p>
+    <w:p>
+      <w:pPr>
+        <w:rPr>
+          <w:b/>
+          <w:lang w:val="es-MX"/>
+        </w:rPr>
+      </w:pPr>
+      <w:r>
+        <w:rPr>
+          <w:b/>
+          <w:lang w:val="es-MX"/>
+        </w:rPr>
+        <w:t>REPORTE VENTAS</w:t>
+      </w:r>
+    </w:p>
+    <w:p>
+      <w:pPr>
+        <w:rPr>
+          <w:lang w:val="es-MX"/>
+        </w:rPr>
+      </w:pPr>
+      <w:r>
+        <w:rPr>
+          <w:lang w:val="es-MX"/>
+        </w:rPr>
+        <w:t xml:space="preserve">Agregar tabla de % ventas x medio de pago (ver si con </w:t>
       </w:r>
       <w:proofErr w:type="spellStart"/>
       <w:r>
         <w:rPr>
-          <w:highlight w:val="green"/>
-          <w:lang w:val="es-MX"/>
-        </w:rPr>
-        <w:t>etc</w:t>
+          <w:lang w:val="es-MX"/>
+        </w:rPr>
+        <w:t>ODoo</w:t>
       </w:r>
       <w:proofErr w:type="spellEnd"/>
       <w:r>
         <w:rPr>
-          <w:highlight w:val="green"/>
-          <w:lang w:val="es-MX"/>
-        </w:rPr>
-        <w:t xml:space="preserve"> al nombre del producto</w:t>
-      </w:r>
-    </w:p>
-    <w:p>
-      <w:pPr>
-        <w:rPr>
-          <w:highlight w:val="green"/>
-          <w:lang w:val="es-MX"/>
-        </w:rPr>
-      </w:pPr>
-      <w:r>
-        <w:rPr>
-          <w:highlight w:val="green"/>
-          <w:lang w:val="es-MX"/>
-        </w:rPr>
-        <w:t xml:space="preserve">En Atributos: agregar pulseras (talle y grosor). Pasar al final lo que es zodíaco, anillos dos letras, </w:t>
+          <w:lang w:val="es-MX"/>
+        </w:rPr>
+        <w:t xml:space="preserve"> o con </w:t>
       </w:r>
       <w:proofErr w:type="spellStart"/>
       <w:r>
         <w:rPr>
-          <w:highlight w:val="green"/>
-          <w:lang w:val="es-MX"/>
-        </w:rPr>
-        <w:t>etc</w:t>
+          <w:lang w:val="es-MX"/>
+        </w:rPr>
+        <w:t>fiserv</w:t>
       </w:r>
       <w:proofErr w:type="spellEnd"/>
-    </w:p>
-    <w:p>
-      <w:pPr>
-        <w:rPr>
-          <w:lang w:val="es-MX"/>
-        </w:rPr>
-      </w:pPr>
-      <w:r>
-        <w:rPr>
-          <w:highlight w:val="green"/>
-          <w:lang w:val="es-MX"/>
-        </w:rPr>
-        <w:t>En Nacionalidad</w:t>
-      </w:r>
-      <w:r>
-        <w:rPr>
-          <w:highlight w:val="green"/>
-          <w:lang w:val="es-MX"/>
-        </w:rPr>
-        <w:t>: agregar los % a la tabla</w:t>
-      </w:r>
-    </w:p>
-    <w:p>
-      <w:pPr>
-        <w:rPr>
-          <w:lang w:val="es-MX"/>
-        </w:rPr>
-      </w:pPr>
-      <w:r>
-        <w:rPr>
-          <w:highlight w:val="green"/>
-          <w:lang w:val="es-MX"/>
-        </w:rPr>
-        <w:t>Precio unitario: redondear valores</w:t>
-      </w:r>
-    </w:p>
-    <w:p>
-      <w:pPr>
-        <w:rPr>
-          <w:lang w:val="es-MX"/>
-        </w:rPr>
-      </w:pPr>
-      <w:r>
-        <w:rPr>
-          <w:lang w:val="es-MX"/>
-        </w:rPr>
-        <w:t xml:space="preserve">Agregar tabla de % ventas x medio de pago (ver si con </w:t>
-      </w:r>
-      <w:proofErr w:type="spellStart"/>
-      <w:r>
-        <w:rPr>
-          <w:lang w:val="es-MX"/>
-        </w:rPr>
-        <w:t>ODoo</w:t>
-      </w:r>
-      <w:proofErr w:type="spellEnd"/>
-      <w:r>
-        <w:rPr>
-          <w:lang w:val="es-MX"/>
-        </w:rPr>
-        <w:t xml:space="preserve"> o con </w:t>
-      </w:r>
-      <w:proofErr w:type="spellStart"/>
-      <w:r>
-        <w:rPr>
-          <w:lang w:val="es-MX"/>
-        </w:rPr>
-        <w:t>fiserv</w:t>
-      </w:r>
-      <w:proofErr w:type="spellEnd"/>
       <w:r>
         <w:rPr>
           <w:lang w:val="es-MX"/>
@@ -189,13 +433,6 @@
     <w:p>
       <w:pPr>
         <w:rPr>
-          <w:lang w:val="es-MX"/>
-        </w:rPr>
-      </w:pPr>
-    </w:p>
-    <w:p>
-      <w:pPr>
-        <w:rPr>
           <w:b/>
           <w:lang w:val="es-MX"/>
         </w:rPr>
@@ -205,217 +442,6 @@
           <w:b/>
           <w:lang w:val="es-MX"/>
         </w:rPr>
-        <w:t>DASHBOARD:</w:t>
-      </w:r>
-    </w:p>
-    <w:p>
-      <w:pPr>
-        <w:rPr>
-          <w:lang w:val="es-MX"/>
-        </w:rPr>
-      </w:pPr>
-      <w:r>
-        <w:rPr>
-          <w:lang w:val="es-MX"/>
-        </w:rPr>
-        <w:t xml:space="preserve">Voy a tener que usar los costos actualizados hacia atrás. Me va a avisar Rocío cuando lo tenga listo en </w:t>
-      </w:r>
-      <w:proofErr w:type="spellStart"/>
-      <w:r>
-        <w:rPr>
-          <w:lang w:val="es-MX"/>
-        </w:rPr>
-        <w:t>Odoo</w:t>
-      </w:r>
-      <w:proofErr w:type="spellEnd"/>
-    </w:p>
-    <w:p>
-      <w:pPr>
-        <w:rPr>
-          <w:lang w:val="es-MX"/>
-        </w:rPr>
-      </w:pPr>
-      <w:proofErr w:type="spellStart"/>
-      <w:r>
-        <w:rPr>
-          <w:lang w:val="es-MX"/>
-        </w:rPr>
-        <w:t>Pack</w:t>
-      </w:r>
-      <w:r>
-        <w:rPr>
-          <w:lang w:val="es-MX"/>
-        </w:rPr>
-        <w:t>aging</w:t>
-      </w:r>
-      <w:proofErr w:type="spellEnd"/>
-      <w:r>
-        <w:rPr>
-          <w:lang w:val="es-MX"/>
-        </w:rPr>
-        <w:t>: Ro va a ver con las chicas los remitos para poder hacer el cálculo con el inventario de Roxana</w:t>
-      </w:r>
-    </w:p>
-    <w:p>
-      <w:pPr>
-        <w:rPr>
-          <w:lang w:val="es-MX"/>
-        </w:rPr>
-      </w:pPr>
-      <w:r>
-        <w:rPr>
-          <w:lang w:val="es-MX"/>
-        </w:rPr>
-        <w:t>Servicios: cambiarle el nombre x Gastos extraordinarios y ver si puedo ponerle un comentario para que se sepa de qué se trata</w:t>
-      </w:r>
-    </w:p>
-    <w:p>
-      <w:pPr>
-        <w:rPr>
-          <w:lang w:val="es-MX"/>
-        </w:rPr>
-      </w:pPr>
-      <w:r>
-        <w:rPr>
-          <w:lang w:val="es-MX"/>
-        </w:rPr>
-        <w:t>Incentivo (sueldos)</w:t>
-      </w:r>
-      <w:r>
-        <w:rPr>
-          <w:lang w:val="es-MX"/>
-        </w:rPr>
-        <w:t>: llamarlo Premio x venta y una parte sale de los recibos de sueldo. La otra parte pedir a Silvina (</w:t>
-      </w:r>
-      <w:r>
-        <w:rPr>
-          <w:lang w:val="es-MX"/>
-        </w:rPr>
-        <w:t>lo que se paga por afuera a las encargadas, no supervisoras)</w:t>
-      </w:r>
-      <w:r>
-        <w:rPr>
-          <w:lang w:val="es-MX"/>
-        </w:rPr>
-        <w:t xml:space="preserve"> SUMAR ESTO AL </w:t>
-      </w:r>
-      <w:r>
-        <w:rPr>
-          <w:b/>
-          <w:lang w:val="es-MX"/>
-        </w:rPr>
-        <w:t>REPORTE DE GASTOS</w:t>
-      </w:r>
-      <w:r>
-        <w:rPr>
-          <w:lang w:val="es-MX"/>
-        </w:rPr>
-        <w:t xml:space="preserve"> (DISCRIMINANDO INCENTIVO DE SUELDO)</w:t>
-      </w:r>
-    </w:p>
-    <w:p>
-      <w:pPr>
-        <w:rPr>
-          <w:lang w:val="es-MX"/>
-        </w:rPr>
-      </w:pPr>
-      <w:r>
-        <w:rPr>
-          <w:highlight w:val="yellow"/>
-          <w:lang w:val="es-MX"/>
-        </w:rPr>
-        <w:t>Revisar los sueldos que ante = cantidad de horas dan más altos en abril</w:t>
-      </w:r>
-    </w:p>
-    <w:p>
-      <w:pPr>
-        <w:rPr>
-          <w:lang w:val="es-MX"/>
-        </w:rPr>
-      </w:pPr>
-    </w:p>
-    <w:p>
-      <w:pPr>
-        <w:rPr>
-          <w:lang w:val="es-MX"/>
-        </w:rPr>
-      </w:pPr>
-    </w:p>
-    <w:p>
-      <w:pPr>
-        <w:rPr>
-          <w:b/>
-          <w:lang w:val="es-MX"/>
-        </w:rPr>
-      </w:pPr>
-      <w:r>
-        <w:rPr>
-          <w:b/>
-          <w:lang w:val="es-MX"/>
-        </w:rPr>
-        <w:t>REPORTE VENTAS</w:t>
-      </w:r>
-    </w:p>
-    <w:p>
-      <w:pPr>
-        <w:rPr>
-          <w:lang w:val="es-MX"/>
-        </w:rPr>
-      </w:pPr>
-      <w:r>
-        <w:rPr>
-          <w:lang w:val="es-MX"/>
-        </w:rPr>
-        <w:t xml:space="preserve">Agregar tabla de % ventas x medio de pago (ver si con </w:t>
-      </w:r>
-      <w:proofErr w:type="spellStart"/>
-      <w:r>
-        <w:rPr>
-          <w:lang w:val="es-MX"/>
-        </w:rPr>
-        <w:t>ODoo</w:t>
-      </w:r>
-      <w:proofErr w:type="spellEnd"/>
-      <w:r>
-        <w:rPr>
-          <w:lang w:val="es-MX"/>
-        </w:rPr>
-        <w:t xml:space="preserve"> o con </w:t>
-      </w:r>
-      <w:proofErr w:type="spellStart"/>
-      <w:r>
-        <w:rPr>
-          <w:lang w:val="es-MX"/>
-        </w:rPr>
-        <w:t>fiserv</w:t>
-      </w:r>
-      <w:proofErr w:type="spellEnd"/>
-      <w:r>
-        <w:rPr>
-          <w:lang w:val="es-MX"/>
-        </w:rPr>
-        <w:t>)</w:t>
-      </w:r>
-    </w:p>
-    <w:p>
-      <w:pPr>
-        <w:rPr>
-          <w:lang w:val="es-MX"/>
-        </w:rPr>
-      </w:pPr>
-    </w:p>
-    <w:p>
-      <w:pPr>
-        <w:rPr>
-          <w:b/>
-          <w:lang w:val="es-MX"/>
-        </w:rPr>
-      </w:pPr>
-      <w:r>
-        <w:rPr>
-          <w:b/>
-          <w:lang w:val="es-MX"/>
-        </w:rPr>
         <w:t>DASHBOARD PARA SUPERVISORAS</w:t>
       </w:r>
     </w:p>
@@ -429,6 +455,7 @@
         <w:rPr>
           <w:lang w:val="es-MX"/>
         </w:rPr>
+        <w:lastRenderedPageBreak/>
         <w:t>Indicadores propios a definir x Rocío</w:t>
       </w:r>
     </w:p>

</xml_diff>

<commit_message>
Creé Joyeria_sin_venta.Rmd y hice cambios en Reporte de ventas de joyería para que tome bien los nuevos productos de cuero (anillos, pulseras, etc)
</commit_message>
<xml_diff>
--- a/Cambios a Reportes.docx
+++ b/Cambios a Reportes.docx
@@ -144,214 +144,211 @@
       </w:pPr>
       <w:r>
         <w:rPr>
-          <w:lang w:val="es-MX"/>
-        </w:rPr>
-        <w:t xml:space="preserve">Agregar tabla de % ventas x medio de pago (ver si con </w:t>
-      </w:r>
-      <w:proofErr w:type="spellStart"/>
-      <w:r>
-        <w:rPr>
-          <w:lang w:val="es-MX"/>
-        </w:rPr>
-        <w:t>ODoo</w:t>
-      </w:r>
-      <w:proofErr w:type="spellEnd"/>
-      <w:r>
-        <w:rPr>
-          <w:lang w:val="es-MX"/>
-        </w:rPr>
-        <w:t xml:space="preserve"> o con </w:t>
-      </w:r>
-      <w:proofErr w:type="spellStart"/>
-      <w:r>
-        <w:rPr>
-          <w:lang w:val="es-MX"/>
-        </w:rPr>
-        <w:t>fiserv</w:t>
-      </w:r>
-      <w:proofErr w:type="spellEnd"/>
-      <w:r>
-        <w:rPr>
-          <w:lang w:val="es-MX"/>
-        </w:rPr>
-        <w:t>)</w:t>
-      </w:r>
-      <w:r>
-        <w:rPr>
-          <w:lang w:val="es-MX"/>
-        </w:rPr>
-        <w:t xml:space="preserve"> USAR LO DE SILVINA</w:t>
-      </w:r>
-    </w:p>
-    <w:p>
-      <w:pPr>
-        <w:rPr>
-          <w:lang w:val="es-MX"/>
-        </w:rPr>
-      </w:pPr>
-    </w:p>
-    <w:p>
-      <w:pPr>
-        <w:rPr>
-          <w:lang w:val="es-MX"/>
-        </w:rPr>
-      </w:pPr>
-    </w:p>
-    <w:p>
-      <w:pPr>
-        <w:rPr>
-          <w:b/>
-          <w:lang w:val="es-MX"/>
-        </w:rPr>
-      </w:pPr>
-      <w:r>
-        <w:rPr>
-          <w:b/>
-          <w:lang w:val="es-MX"/>
-        </w:rPr>
-        <w:t>DASHBOARD:</w:t>
-      </w:r>
-    </w:p>
-    <w:p>
-      <w:pPr>
-        <w:rPr>
-          <w:lang w:val="es-MX"/>
-        </w:rPr>
-      </w:pPr>
-      <w:r>
-        <w:rPr>
-          <w:lang w:val="es-MX"/>
-        </w:rPr>
-        <w:t xml:space="preserve">Voy a tener que usar los costos actualizados hacia atrás. Me va a avisar Rocío cuando lo tenga listo en </w:t>
-      </w:r>
-      <w:proofErr w:type="spellStart"/>
-      <w:r>
-        <w:rPr>
-          <w:lang w:val="es-MX"/>
-        </w:rPr>
-        <w:t>Odoo</w:t>
-      </w:r>
-      <w:proofErr w:type="spellEnd"/>
-    </w:p>
-    <w:p>
-      <w:pPr>
-        <w:rPr>
-          <w:lang w:val="es-MX"/>
-        </w:rPr>
-      </w:pPr>
-      <w:proofErr w:type="spellStart"/>
-      <w:r>
-        <w:rPr>
-          <w:lang w:val="es-MX"/>
-        </w:rPr>
-        <w:t>Pack</w:t>
-      </w:r>
-      <w:r>
-        <w:rPr>
-          <w:lang w:val="es-MX"/>
-        </w:rPr>
-        <w:t>aging</w:t>
-      </w:r>
-      <w:proofErr w:type="spellEnd"/>
-      <w:r>
-        <w:rPr>
-          <w:lang w:val="es-MX"/>
-        </w:rPr>
-        <w:t>: Ro va a ver con las chicas los remitos para poder hacer el cálculo con el inventario de Roxana</w:t>
-      </w:r>
-    </w:p>
-    <w:p>
-      <w:pPr>
-        <w:rPr>
-          <w:lang w:val="es-MX"/>
-        </w:rPr>
-      </w:pPr>
-      <w:r>
-        <w:rPr>
-          <w:lang w:val="es-MX"/>
-        </w:rPr>
-        <w:t>Servicios: cambiarle el nombre x Gastos extraordinarios y ver si puedo ponerle un comentario para que se sepa de qué se trata</w:t>
-      </w:r>
-    </w:p>
-    <w:p>
-      <w:pPr>
-        <w:rPr>
-          <w:lang w:val="es-MX"/>
-        </w:rPr>
-      </w:pPr>
-      <w:r>
-        <w:rPr>
-          <w:lang w:val="es-MX"/>
-        </w:rPr>
-        <w:t>Incentivo (sueldos)</w:t>
-      </w:r>
-      <w:r>
-        <w:rPr>
-          <w:lang w:val="es-MX"/>
-        </w:rPr>
-        <w:t>: llamarlo Premio x venta y una parte sale de los recibos de sueldo. La otra parte pedir a Silvina (</w:t>
-      </w:r>
-      <w:r>
-        <w:rPr>
-          <w:lang w:val="es-MX"/>
-        </w:rPr>
-        <w:t>lo que se paga por afuera a las encargadas, no supervisoras)</w:t>
-      </w:r>
-      <w:r>
-        <w:rPr>
-          <w:lang w:val="es-MX"/>
-        </w:rPr>
-        <w:t xml:space="preserve"> SUMAR ESTO AL </w:t>
-      </w:r>
-      <w:r>
-        <w:rPr>
-          <w:b/>
-          <w:lang w:val="es-MX"/>
-        </w:rPr>
-        <w:t>REPORTE DE GASTOS</w:t>
-      </w:r>
-      <w:r>
-        <w:rPr>
-          <w:lang w:val="es-MX"/>
-        </w:rPr>
-        <w:t xml:space="preserve"> (DISCRIMINANDO INCENTIVO DE SUELDO)</w:t>
-      </w:r>
-    </w:p>
-    <w:p>
-      <w:pPr>
-        <w:rPr>
-          <w:lang w:val="es-MX"/>
-        </w:rPr>
-      </w:pPr>
-      <w:r>
-        <w:rPr>
-          <w:highlight w:val="yellow"/>
-          <w:lang w:val="es-MX"/>
-        </w:rPr>
-        <w:t>Revisar los sueldos que ante = cantidad de horas dan más altos en abril</w:t>
-      </w:r>
-    </w:p>
-    <w:p>
-      <w:pPr>
-        <w:rPr>
-          <w:lang w:val="es-MX"/>
-        </w:rPr>
-      </w:pPr>
-      <w:r>
-        <w:rPr>
-          <w:lang w:val="es-MX"/>
-        </w:rPr>
-        <w:t>Eliminar el gasto del vidrio de AS San Telmo</w:t>
-      </w:r>
-    </w:p>
-    <w:p>
-      <w:pPr>
-        <w:rPr>
-          <w:lang w:val="es-MX"/>
-        </w:rPr>
-      </w:pPr>
+          <w:highlight w:val="green"/>
+          <w:lang w:val="es-MX"/>
+        </w:rPr>
+        <w:t>Agregar tabla de % ventas x medio de pa</w:t>
+      </w:r>
+      <w:r>
+        <w:rPr>
+          <w:highlight w:val="green"/>
+          <w:lang w:val="es-MX"/>
+        </w:rPr>
+        <w:t>go (</w:t>
+      </w:r>
       <w:bookmarkStart w:id="0" w:name="_GoBack"/>
       <w:bookmarkEnd w:id="0"/>
+      <w:r>
+        <w:rPr>
+          <w:highlight w:val="green"/>
+          <w:lang w:val="es-MX"/>
+        </w:rPr>
+        <w:t xml:space="preserve">con </w:t>
+      </w:r>
+      <w:proofErr w:type="spellStart"/>
+      <w:r>
+        <w:rPr>
+          <w:highlight w:val="green"/>
+          <w:lang w:val="es-MX"/>
+        </w:rPr>
+        <w:t>ODoo</w:t>
+      </w:r>
+      <w:proofErr w:type="spellEnd"/>
+      <w:r>
+        <w:rPr>
+          <w:highlight w:val="green"/>
+          <w:lang w:val="es-MX"/>
+        </w:rPr>
+        <w:t>)</w:t>
+      </w:r>
+    </w:p>
+    <w:p>
+      <w:pPr>
+        <w:rPr>
+          <w:lang w:val="es-MX"/>
+        </w:rPr>
+      </w:pPr>
+    </w:p>
+    <w:p>
+      <w:pPr>
+        <w:rPr>
+          <w:lang w:val="es-MX"/>
+        </w:rPr>
+      </w:pPr>
+    </w:p>
+    <w:p>
+      <w:pPr>
+        <w:rPr>
+          <w:b/>
+          <w:lang w:val="es-MX"/>
+        </w:rPr>
+      </w:pPr>
+      <w:r>
+        <w:rPr>
+          <w:b/>
+          <w:lang w:val="es-MX"/>
+        </w:rPr>
+        <w:t>DASHBOARD:</w:t>
+      </w:r>
+    </w:p>
+    <w:p>
+      <w:pPr>
+        <w:rPr>
+          <w:lang w:val="es-MX"/>
+        </w:rPr>
+      </w:pPr>
+      <w:r>
+        <w:rPr>
+          <w:lang w:val="es-MX"/>
+        </w:rPr>
+        <w:t xml:space="preserve">Voy a tener que usar los costos actualizados hacia atrás. Me va a avisar Rocío cuando lo tenga listo en </w:t>
+      </w:r>
+      <w:proofErr w:type="spellStart"/>
+      <w:r>
+        <w:rPr>
+          <w:lang w:val="es-MX"/>
+        </w:rPr>
+        <w:t>Odoo</w:t>
+      </w:r>
+      <w:proofErr w:type="spellEnd"/>
+    </w:p>
+    <w:p>
+      <w:pPr>
+        <w:rPr>
+          <w:lang w:val="es-MX"/>
+        </w:rPr>
+      </w:pPr>
+      <w:proofErr w:type="spellStart"/>
+      <w:r>
+        <w:rPr>
+          <w:lang w:val="es-MX"/>
+        </w:rPr>
+        <w:t>Pack</w:t>
+      </w:r>
+      <w:r>
+        <w:rPr>
+          <w:lang w:val="es-MX"/>
+        </w:rPr>
+        <w:t>aging</w:t>
+      </w:r>
+      <w:proofErr w:type="spellEnd"/>
+      <w:r>
+        <w:rPr>
+          <w:lang w:val="es-MX"/>
+        </w:rPr>
+        <w:t>: Ro va a ver con las chicas los remitos para poder hacer el cálculo con el inventario de Roxana</w:t>
+      </w:r>
+    </w:p>
+    <w:p>
+      <w:pPr>
+        <w:rPr>
+          <w:lang w:val="es-MX"/>
+        </w:rPr>
+      </w:pPr>
+      <w:r>
+        <w:rPr>
+          <w:lang w:val="es-MX"/>
+        </w:rPr>
+        <w:t>Servicios: cambiarle el nombre x Gastos extraordinarios y ver si puedo ponerle un comentario para que se sepa de qué se trata</w:t>
+      </w:r>
+    </w:p>
+    <w:p>
+      <w:pPr>
+        <w:rPr>
+          <w:lang w:val="es-MX"/>
+        </w:rPr>
+      </w:pPr>
+      <w:r>
+        <w:rPr>
+          <w:lang w:val="es-MX"/>
+        </w:rPr>
+        <w:t>Incentivo (sueldos)</w:t>
+      </w:r>
+      <w:r>
+        <w:rPr>
+          <w:lang w:val="es-MX"/>
+        </w:rPr>
+        <w:t>: llamarlo Premio x venta y una parte sale de los recibos de sueldo. La otra parte pedir a Silvina (</w:t>
+      </w:r>
+      <w:r>
+        <w:rPr>
+          <w:lang w:val="es-MX"/>
+        </w:rPr>
+        <w:t>lo que se paga por afuera a las encargadas, no supervisoras)</w:t>
+      </w:r>
+      <w:r>
+        <w:rPr>
+          <w:lang w:val="es-MX"/>
+        </w:rPr>
+        <w:t xml:space="preserve"> SUMAR ESTO AL </w:t>
+      </w:r>
+      <w:r>
+        <w:rPr>
+          <w:b/>
+          <w:lang w:val="es-MX"/>
+        </w:rPr>
+        <w:t>REPORTE DE GASTOS</w:t>
+      </w:r>
+      <w:r>
+        <w:rPr>
+          <w:lang w:val="es-MX"/>
+        </w:rPr>
+        <w:t xml:space="preserve"> (DISCRIMINANDO INCENTIVO DE SUELDO)</w:t>
+      </w:r>
+    </w:p>
+    <w:p>
+      <w:pPr>
+        <w:rPr>
+          <w:lang w:val="es-MX"/>
+        </w:rPr>
+      </w:pPr>
+      <w:r>
+        <w:rPr>
+          <w:highlight w:val="yellow"/>
+          <w:lang w:val="es-MX"/>
+        </w:rPr>
+        <w:t>Revisar los sueldos que ante = cantidad de horas dan más altos en abril</w:t>
+      </w:r>
+    </w:p>
+    <w:p>
+      <w:pPr>
+        <w:rPr>
+          <w:lang w:val="es-MX"/>
+        </w:rPr>
+      </w:pPr>
+      <w:r>
+        <w:rPr>
+          <w:lang w:val="es-MX"/>
+        </w:rPr>
+        <w:t>Eliminar el gasto del vidrio de AS San Telmo</w:t>
+      </w:r>
+    </w:p>
+    <w:p>
+      <w:pPr>
+        <w:rPr>
+          <w:lang w:val="es-MX"/>
+        </w:rPr>
+      </w:pPr>
     </w:p>
     <w:p>
       <w:pPr>

</xml_diff>

<commit_message>
“eliminé duplicados en lista de precios, terminé de adaptar Reporte de ventas CUERO. Creé el reporte de mayo
</commit_message>
<xml_diff>
--- a/Cambios a Reportes.docx
+++ b/Cambios a Reportes.docx
@@ -1,6 +1,6 @@
 
 <file path=word/document.xml><?xml version="1.0" encoding="utf-8"?>
-<w:document xmlns:wpc="http://schemas.microsoft.com/office/word/2010/wordprocessingCanvas" xmlns:cx="http://schemas.microsoft.com/office/drawing/2014/chartex" xmlns:cx1="http://schemas.microsoft.com/office/drawing/2015/9/8/chartex" xmlns:mc="http://schemas.openxmlformats.org/markup-compatibility/2006" xmlns:o="urn:schemas-microsoft-com:office:office" xmlns:r="http://schemas.openxmlformats.org/officeDocument/2006/relationships" xmlns:m="http://schemas.openxmlformats.org/officeDocument/2006/math" xmlns:v="urn:schemas-microsoft-com:vml" xmlns:wp14="http://schemas.microsoft.com/office/word/2010/wordprocessingDrawing" xmlns:wp="http://schemas.openxmlformats.org/drawingml/2006/wordprocessingDrawing" xmlns:w10="urn:schemas-microsoft-com:office:word" xmlns:w="http://schemas.openxmlformats.org/wordprocessingml/2006/main" xmlns:w14="http://schemas.microsoft.com/office/word/2010/wordml" xmlns:w15="http://schemas.microsoft.com/office/word/2012/wordml" xmlns:w16se="http://schemas.microsoft.com/office/word/2015/wordml/symex" xmlns:wpg="http://schemas.microsoft.com/office/word/2010/wordprocessingGroup" xmlns:wpi="http://schemas.microsoft.com/office/word/2010/wordprocessingInk" xmlns:wne="http://schemas.microsoft.com/office/word/2006/wordml" xmlns:wps="http://schemas.microsoft.com/office/word/2010/wordprocessingShape" mc:Ignorable="w14 w15 w16se wp14">
+<w:document xmlns:wpc="http://schemas.microsoft.com/office/word/2010/wordprocessingCanvas" xmlns:cx="http://schemas.microsoft.com/office/drawing/2014/chartex" xmlns:mc="http://schemas.openxmlformats.org/markup-compatibility/2006" xmlns:o="urn:schemas-microsoft-com:office:office" xmlns:r="http://schemas.openxmlformats.org/officeDocument/2006/relationships" xmlns:m="http://schemas.openxmlformats.org/officeDocument/2006/math" xmlns:v="urn:schemas-microsoft-com:vml" xmlns:wp14="http://schemas.microsoft.com/office/word/2010/wordprocessingDrawing" xmlns:wp="http://schemas.openxmlformats.org/drawingml/2006/wordprocessingDrawing" xmlns:w10="urn:schemas-microsoft-com:office:word" xmlns:w="http://schemas.openxmlformats.org/wordprocessingml/2006/main" xmlns:w14="http://schemas.microsoft.com/office/word/2010/wordml" xmlns:w15="http://schemas.microsoft.com/office/word/2012/wordml" xmlns:w16se="http://schemas.microsoft.com/office/word/2015/wordml/symex" xmlns:wpg="http://schemas.microsoft.com/office/word/2010/wordprocessingGroup" xmlns:wpi="http://schemas.microsoft.com/office/word/2010/wordprocessingInk" xmlns:wne="http://schemas.microsoft.com/office/word/2006/wordml" xmlns:wps="http://schemas.microsoft.com/office/word/2010/wordprocessingShape" mc:Ignorable="w14 w15 w16se wp14">
   <w:body>
     <w:p>
       <w:pPr>
@@ -154,307 +154,456 @@
           <w:highlight w:val="green"/>
           <w:lang w:val="es-MX"/>
         </w:rPr>
-        <w:t>go (</w:t>
+        <w:t xml:space="preserve">go (con </w:t>
+      </w:r>
+      <w:proofErr w:type="spellStart"/>
+      <w:r>
+        <w:rPr>
+          <w:highlight w:val="green"/>
+          <w:lang w:val="es-MX"/>
+        </w:rPr>
+        <w:t>ODoo</w:t>
+      </w:r>
+      <w:proofErr w:type="spellEnd"/>
+      <w:r>
+        <w:rPr>
+          <w:highlight w:val="green"/>
+          <w:lang w:val="es-MX"/>
+        </w:rPr>
+        <w:t>)</w:t>
+      </w:r>
+    </w:p>
+    <w:p>
+      <w:pPr>
+        <w:rPr>
+          <w:lang w:val="es-MX"/>
+        </w:rPr>
+      </w:pPr>
+    </w:p>
+    <w:p>
+      <w:pPr>
+        <w:rPr>
+          <w:lang w:val="es-MX"/>
+        </w:rPr>
+      </w:pPr>
+    </w:p>
+    <w:p>
+      <w:pPr>
+        <w:rPr>
+          <w:b/>
+          <w:lang w:val="es-MX"/>
+        </w:rPr>
+      </w:pPr>
+      <w:r>
+        <w:rPr>
+          <w:b/>
+          <w:lang w:val="es-MX"/>
+        </w:rPr>
+        <w:t>DASHBOARD:</w:t>
+      </w:r>
+    </w:p>
+    <w:p>
+      <w:pPr>
+        <w:rPr>
+          <w:lang w:val="es-MX"/>
+        </w:rPr>
+      </w:pPr>
+      <w:r>
+        <w:rPr>
+          <w:lang w:val="es-MX"/>
+        </w:rPr>
+        <w:t xml:space="preserve">Voy a tener que usar los costos actualizados hacia atrás. Me va a avisar Rocío cuando lo tenga listo en </w:t>
+      </w:r>
+      <w:proofErr w:type="spellStart"/>
+      <w:r>
+        <w:rPr>
+          <w:lang w:val="es-MX"/>
+        </w:rPr>
+        <w:t>Odoo</w:t>
+      </w:r>
+      <w:proofErr w:type="spellEnd"/>
+    </w:p>
+    <w:p>
+      <w:pPr>
+        <w:rPr>
+          <w:lang w:val="es-MX"/>
+        </w:rPr>
+      </w:pPr>
+      <w:proofErr w:type="spellStart"/>
+      <w:r>
+        <w:rPr>
+          <w:lang w:val="es-MX"/>
+        </w:rPr>
+        <w:t>Pack</w:t>
+      </w:r>
+      <w:r>
+        <w:rPr>
+          <w:lang w:val="es-MX"/>
+        </w:rPr>
+        <w:t>aging</w:t>
+      </w:r>
+      <w:proofErr w:type="spellEnd"/>
+      <w:r>
+        <w:rPr>
+          <w:lang w:val="es-MX"/>
+        </w:rPr>
+        <w:t>: Ro va a ver con las chicas los remitos para poder hacer el cálculo con el inventario de Roxana</w:t>
+      </w:r>
+    </w:p>
+    <w:p>
+      <w:pPr>
+        <w:rPr>
+          <w:lang w:val="es-MX"/>
+        </w:rPr>
+      </w:pPr>
+      <w:r>
+        <w:rPr>
+          <w:lang w:val="es-MX"/>
+        </w:rPr>
+        <w:t>Servicios: cambiarle el nombre x Gastos extraordinarios y ver si puedo ponerle un comentario para que se sepa de qué se trata</w:t>
+      </w:r>
+    </w:p>
+    <w:p>
+      <w:pPr>
+        <w:rPr>
+          <w:lang w:val="es-MX"/>
+        </w:rPr>
+      </w:pPr>
+      <w:r>
+        <w:rPr>
+          <w:lang w:val="es-MX"/>
+        </w:rPr>
+        <w:t>Incentivo (sueldos)</w:t>
+      </w:r>
+      <w:r>
+        <w:rPr>
+          <w:lang w:val="es-MX"/>
+        </w:rPr>
+        <w:t>: llamarlo Premio x venta y una parte sale de los recibos de sueldo. La otra parte pedir a Silvina (</w:t>
+      </w:r>
+      <w:r>
+        <w:rPr>
+          <w:lang w:val="es-MX"/>
+        </w:rPr>
+        <w:t>lo que se paga por afuera a las encargadas, no supervisoras)</w:t>
+      </w:r>
+      <w:r>
+        <w:rPr>
+          <w:lang w:val="es-MX"/>
+        </w:rPr>
+        <w:t xml:space="preserve"> SUMAR ESTO AL </w:t>
+      </w:r>
+      <w:r>
+        <w:rPr>
+          <w:b/>
+          <w:lang w:val="es-MX"/>
+        </w:rPr>
+        <w:t>REPORTE DE GASTOS</w:t>
+      </w:r>
+      <w:r>
+        <w:rPr>
+          <w:lang w:val="es-MX"/>
+        </w:rPr>
+        <w:t xml:space="preserve"> (DISCRIMINANDO INCENTIVO DE SUELDO)</w:t>
+      </w:r>
+    </w:p>
+    <w:p>
+      <w:pPr>
+        <w:rPr>
+          <w:lang w:val="es-MX"/>
+        </w:rPr>
+      </w:pPr>
+      <w:r>
+        <w:rPr>
+          <w:highlight w:val="yellow"/>
+          <w:lang w:val="es-MX"/>
+        </w:rPr>
+        <w:t>Revisar los sueldos que ante = cantidad de horas dan más altos en abril</w:t>
+      </w:r>
+    </w:p>
+    <w:p>
+      <w:pPr>
+        <w:rPr>
+          <w:lang w:val="es-MX"/>
+        </w:rPr>
+      </w:pPr>
+      <w:r>
+        <w:rPr>
+          <w:lang w:val="es-MX"/>
+        </w:rPr>
+        <w:t>Eliminar el gasto del vidrio de AS San Telmo</w:t>
+      </w:r>
+    </w:p>
+    <w:p>
+      <w:pPr>
+        <w:rPr>
+          <w:lang w:val="es-MX"/>
+        </w:rPr>
+      </w:pPr>
+    </w:p>
+    <w:p>
+      <w:pPr>
+        <w:rPr>
+          <w:lang w:val="es-MX"/>
+        </w:rPr>
+      </w:pPr>
+    </w:p>
+    <w:p>
+      <w:pPr>
+        <w:rPr>
+          <w:lang w:val="es-MX"/>
+        </w:rPr>
+      </w:pPr>
+    </w:p>
+    <w:p>
+      <w:pPr>
+        <w:rPr>
+          <w:b/>
+          <w:lang w:val="es-MX"/>
+        </w:rPr>
+      </w:pPr>
+      <w:r>
+        <w:rPr>
+          <w:b/>
+          <w:lang w:val="es-MX"/>
+        </w:rPr>
+        <w:t>REPORTE VENTAS</w:t>
+      </w:r>
+    </w:p>
+    <w:p>
+      <w:pPr>
+        <w:rPr>
+          <w:lang w:val="es-MX"/>
+        </w:rPr>
+      </w:pPr>
+      <w:r>
+        <w:rPr>
+          <w:lang w:val="es-MX"/>
+        </w:rPr>
+        <w:t xml:space="preserve">Agregar tabla de % ventas x medio de pago (ver si con </w:t>
+      </w:r>
+      <w:proofErr w:type="spellStart"/>
+      <w:r>
+        <w:rPr>
+          <w:lang w:val="es-MX"/>
+        </w:rPr>
+        <w:t>ODoo</w:t>
+      </w:r>
+      <w:proofErr w:type="spellEnd"/>
+      <w:r>
+        <w:rPr>
+          <w:lang w:val="es-MX"/>
+        </w:rPr>
+        <w:t xml:space="preserve"> o con </w:t>
+      </w:r>
+      <w:proofErr w:type="spellStart"/>
+      <w:r>
+        <w:rPr>
+          <w:lang w:val="es-MX"/>
+        </w:rPr>
+        <w:t>fiserv</w:t>
+      </w:r>
+      <w:proofErr w:type="spellEnd"/>
+      <w:r>
+        <w:rPr>
+          <w:lang w:val="es-MX"/>
+        </w:rPr>
+        <w:t>)</w:t>
+      </w:r>
+    </w:p>
+    <w:p>
+      <w:pPr>
+        <w:rPr>
+          <w:lang w:val="es-MX"/>
+        </w:rPr>
+      </w:pPr>
+    </w:p>
+    <w:p>
+      <w:pPr>
+        <w:rPr>
+          <w:b/>
+          <w:lang w:val="es-MX"/>
+        </w:rPr>
+      </w:pPr>
+      <w:r>
+        <w:rPr>
+          <w:b/>
+          <w:lang w:val="es-MX"/>
+        </w:rPr>
+        <w:t>DASHBOARD PARA SUPERVISORAS</w:t>
+      </w:r>
+    </w:p>
+    <w:p>
+      <w:pPr>
+        <w:rPr>
+          <w:b/>
+          <w:lang w:val="es-MX"/>
+        </w:rPr>
+      </w:pPr>
+      <w:r>
+        <w:rPr>
+          <w:lang w:val="es-MX"/>
+        </w:rPr>
+        <w:lastRenderedPageBreak/>
+        <w:t>Indicadores propios a definir x Rocío</w:t>
+      </w:r>
+      <w:r>
+        <w:rPr>
+          <w:lang w:val="es-MX"/>
+        </w:rPr>
+        <w:br/>
+      </w:r>
+      <w:r>
+        <w:rPr>
+          <w:lang w:val="es-MX"/>
+        </w:rPr>
+        <w:br/>
+      </w:r>
+      <w:r>
+        <w:rPr>
+          <w:b/>
+          <w:lang w:val="es-MX"/>
+        </w:rPr>
+        <w:t>DEBUTANTES</w:t>
+      </w:r>
+    </w:p>
+    <w:p>
+      <w:pPr>
+        <w:rPr>
+          <w:lang w:val="es-MX"/>
+        </w:rPr>
+      </w:pPr>
+      <w:r>
+        <w:rPr>
+          <w:lang w:val="es-MX"/>
+        </w:rPr>
+        <w:t xml:space="preserve">Rocío me va a pasar la lista. Crear un reporte con </w:t>
+      </w:r>
+      <w:proofErr w:type="spellStart"/>
+      <w:r>
+        <w:rPr>
+          <w:lang w:val="es-MX"/>
+        </w:rPr>
+        <w:t>table</w:t>
+      </w:r>
+      <w:proofErr w:type="spellEnd"/>
+      <w:r>
+        <w:rPr>
+          <w:lang w:val="es-MX"/>
+        </w:rPr>
+        <w:t xml:space="preserve"> semanal de ventas</w:t>
+      </w:r>
+    </w:p>
+    <w:p>
+      <w:pPr>
+        <w:rPr>
+          <w:lang w:val="es-MX"/>
+        </w:rPr>
+      </w:pPr>
+    </w:p>
+    <w:p>
+      <w:pPr>
+        <w:rPr>
+          <w:b/>
+          <w:lang w:val="es-MX"/>
+        </w:rPr>
+      </w:pPr>
+      <w:r>
+        <w:rPr>
+          <w:b/>
+          <w:lang w:val="es-MX"/>
+        </w:rPr>
+        <w:t>VENTA</w:t>
+      </w:r>
+      <w:r>
+        <w:rPr>
+          <w:b/>
+          <w:lang w:val="es-MX"/>
+        </w:rPr>
+        <w:t>S DE JOYERÍA ACUMULADA</w:t>
+      </w:r>
+    </w:p>
+    <w:p>
+      <w:pPr>
+        <w:rPr>
+          <w:lang w:val="es-MX"/>
+        </w:rPr>
+      </w:pPr>
+      <w:r>
+        <w:rPr>
+          <w:lang w:val="es-MX"/>
+        </w:rPr>
+        <w:t xml:space="preserve">Repetir el reporte de </w:t>
+      </w:r>
+      <w:proofErr w:type="gramStart"/>
+      <w:r>
+        <w:rPr>
+          <w:lang w:val="es-MX"/>
+        </w:rPr>
+        <w:t>Joyería</w:t>
+      </w:r>
+      <w:proofErr w:type="gramEnd"/>
+      <w:r>
+        <w:rPr>
+          <w:lang w:val="es-MX"/>
+        </w:rPr>
+        <w:t xml:space="preserve"> pero con datos acumulados desde el </w:t>
+      </w:r>
+      <w:proofErr w:type="spellStart"/>
+      <w:r>
+        <w:rPr>
+          <w:lang w:val="es-MX"/>
+        </w:rPr>
+        <w:t>ppio</w:t>
+      </w:r>
+      <w:proofErr w:type="spellEnd"/>
+      <w:r>
+        <w:rPr>
+          <w:lang w:val="es-MX"/>
+        </w:rPr>
+        <w:t xml:space="preserve"> hasta el día de realización del reporte</w:t>
+      </w:r>
+      <w:r>
+        <w:rPr>
+          <w:lang w:val="es-MX"/>
+        </w:rPr>
+        <w:t>.</w:t>
+      </w:r>
+    </w:p>
+    <w:p>
+      <w:pPr>
+        <w:rPr>
+          <w:lang w:val="es-MX"/>
+        </w:rPr>
+      </w:pPr>
+      <w:r>
+        <w:rPr>
+          <w:lang w:val="es-MX"/>
+        </w:rPr>
+        <w:t>No va la hoja de stock sin venta</w:t>
+      </w:r>
+    </w:p>
+    <w:p>
+      <w:pPr>
+        <w:rPr>
+          <w:lang w:val="es-MX"/>
+        </w:rPr>
+      </w:pPr>
+    </w:p>
+    <w:p>
+      <w:pPr>
+        <w:rPr>
+          <w:lang w:val="es-MX"/>
+        </w:rPr>
+      </w:pPr>
+      <w:r>
+        <w:rPr>
+          <w:lang w:val="es-MX"/>
+        </w:rPr>
+        <w:t>COMMIT</w:t>
       </w:r>
       <w:bookmarkStart w:id="0" w:name="_GoBack"/>
       <w:bookmarkEnd w:id="0"/>
-      <w:r>
-        <w:rPr>
-          <w:highlight w:val="green"/>
-          <w:lang w:val="es-MX"/>
-        </w:rPr>
-        <w:t xml:space="preserve">con </w:t>
-      </w:r>
-      <w:proofErr w:type="spellStart"/>
-      <w:r>
-        <w:rPr>
-          <w:highlight w:val="green"/>
-          <w:lang w:val="es-MX"/>
-        </w:rPr>
-        <w:t>ODoo</w:t>
-      </w:r>
-      <w:proofErr w:type="spellEnd"/>
-      <w:r>
-        <w:rPr>
-          <w:highlight w:val="green"/>
-          <w:lang w:val="es-MX"/>
-        </w:rPr>
-        <w:t>)</w:t>
-      </w:r>
-    </w:p>
-    <w:p>
-      <w:pPr>
-        <w:rPr>
-          <w:lang w:val="es-MX"/>
-        </w:rPr>
-      </w:pPr>
-    </w:p>
-    <w:p>
-      <w:pPr>
-        <w:rPr>
-          <w:lang w:val="es-MX"/>
-        </w:rPr>
-      </w:pPr>
-    </w:p>
-    <w:p>
-      <w:pPr>
-        <w:rPr>
-          <w:b/>
-          <w:lang w:val="es-MX"/>
-        </w:rPr>
-      </w:pPr>
-      <w:r>
-        <w:rPr>
-          <w:b/>
-          <w:lang w:val="es-MX"/>
-        </w:rPr>
-        <w:t>DASHBOARD:</w:t>
-      </w:r>
-    </w:p>
-    <w:p>
-      <w:pPr>
-        <w:rPr>
-          <w:lang w:val="es-MX"/>
-        </w:rPr>
-      </w:pPr>
-      <w:r>
-        <w:rPr>
-          <w:lang w:val="es-MX"/>
-        </w:rPr>
-        <w:t xml:space="preserve">Voy a tener que usar los costos actualizados hacia atrás. Me va a avisar Rocío cuando lo tenga listo en </w:t>
-      </w:r>
-      <w:proofErr w:type="spellStart"/>
-      <w:r>
-        <w:rPr>
-          <w:lang w:val="es-MX"/>
-        </w:rPr>
-        <w:t>Odoo</w:t>
-      </w:r>
-      <w:proofErr w:type="spellEnd"/>
-    </w:p>
-    <w:p>
-      <w:pPr>
-        <w:rPr>
-          <w:lang w:val="es-MX"/>
-        </w:rPr>
-      </w:pPr>
-      <w:proofErr w:type="spellStart"/>
-      <w:r>
-        <w:rPr>
-          <w:lang w:val="es-MX"/>
-        </w:rPr>
-        <w:t>Pack</w:t>
-      </w:r>
-      <w:r>
-        <w:rPr>
-          <w:lang w:val="es-MX"/>
-        </w:rPr>
-        <w:t>aging</w:t>
-      </w:r>
-      <w:proofErr w:type="spellEnd"/>
-      <w:r>
-        <w:rPr>
-          <w:lang w:val="es-MX"/>
-        </w:rPr>
-        <w:t>: Ro va a ver con las chicas los remitos para poder hacer el cálculo con el inventario de Roxana</w:t>
-      </w:r>
-    </w:p>
-    <w:p>
-      <w:pPr>
-        <w:rPr>
-          <w:lang w:val="es-MX"/>
-        </w:rPr>
-      </w:pPr>
-      <w:r>
-        <w:rPr>
-          <w:lang w:val="es-MX"/>
-        </w:rPr>
-        <w:t>Servicios: cambiarle el nombre x Gastos extraordinarios y ver si puedo ponerle un comentario para que se sepa de qué se trata</w:t>
-      </w:r>
-    </w:p>
-    <w:p>
-      <w:pPr>
-        <w:rPr>
-          <w:lang w:val="es-MX"/>
-        </w:rPr>
-      </w:pPr>
-      <w:r>
-        <w:rPr>
-          <w:lang w:val="es-MX"/>
-        </w:rPr>
-        <w:t>Incentivo (sueldos)</w:t>
-      </w:r>
-      <w:r>
-        <w:rPr>
-          <w:lang w:val="es-MX"/>
-        </w:rPr>
-        <w:t>: llamarlo Premio x venta y una parte sale de los recibos de sueldo. La otra parte pedir a Silvina (</w:t>
-      </w:r>
-      <w:r>
-        <w:rPr>
-          <w:lang w:val="es-MX"/>
-        </w:rPr>
-        <w:t>lo que se paga por afuera a las encargadas, no supervisoras)</w:t>
-      </w:r>
-      <w:r>
-        <w:rPr>
-          <w:lang w:val="es-MX"/>
-        </w:rPr>
-        <w:t xml:space="preserve"> SUMAR ESTO AL </w:t>
-      </w:r>
-      <w:r>
-        <w:rPr>
-          <w:b/>
-          <w:lang w:val="es-MX"/>
-        </w:rPr>
-        <w:t>REPORTE DE GASTOS</w:t>
-      </w:r>
-      <w:r>
-        <w:rPr>
-          <w:lang w:val="es-MX"/>
-        </w:rPr>
-        <w:t xml:space="preserve"> (DISCRIMINANDO INCENTIVO DE SUELDO)</w:t>
-      </w:r>
-    </w:p>
-    <w:p>
-      <w:pPr>
-        <w:rPr>
-          <w:lang w:val="es-MX"/>
-        </w:rPr>
-      </w:pPr>
-      <w:r>
-        <w:rPr>
-          <w:highlight w:val="yellow"/>
-          <w:lang w:val="es-MX"/>
-        </w:rPr>
-        <w:t>Revisar los sueldos que ante = cantidad de horas dan más altos en abril</w:t>
-      </w:r>
-    </w:p>
-    <w:p>
-      <w:pPr>
-        <w:rPr>
-          <w:lang w:val="es-MX"/>
-        </w:rPr>
-      </w:pPr>
-      <w:r>
-        <w:rPr>
-          <w:lang w:val="es-MX"/>
-        </w:rPr>
-        <w:t>Eliminar el gasto del vidrio de AS San Telmo</w:t>
-      </w:r>
-    </w:p>
-    <w:p>
-      <w:pPr>
-        <w:rPr>
-          <w:lang w:val="es-MX"/>
-        </w:rPr>
-      </w:pPr>
-    </w:p>
-    <w:p>
-      <w:pPr>
-        <w:rPr>
-          <w:lang w:val="es-MX"/>
-        </w:rPr>
-      </w:pPr>
-    </w:p>
-    <w:p>
-      <w:pPr>
-        <w:rPr>
-          <w:lang w:val="es-MX"/>
-        </w:rPr>
-      </w:pPr>
-    </w:p>
-    <w:p>
-      <w:pPr>
-        <w:rPr>
-          <w:b/>
-          <w:lang w:val="es-MX"/>
-        </w:rPr>
-      </w:pPr>
-      <w:r>
-        <w:rPr>
-          <w:b/>
-          <w:lang w:val="es-MX"/>
-        </w:rPr>
-        <w:t>REPORTE VENTAS</w:t>
-      </w:r>
-    </w:p>
-    <w:p>
-      <w:pPr>
-        <w:rPr>
-          <w:lang w:val="es-MX"/>
-        </w:rPr>
-      </w:pPr>
-      <w:r>
-        <w:rPr>
-          <w:lang w:val="es-MX"/>
-        </w:rPr>
-        <w:t xml:space="preserve">Agregar tabla de % ventas x medio de pago (ver si con </w:t>
-      </w:r>
-      <w:proofErr w:type="spellStart"/>
-      <w:r>
-        <w:rPr>
-          <w:lang w:val="es-MX"/>
-        </w:rPr>
-        <w:t>ODoo</w:t>
-      </w:r>
-      <w:proofErr w:type="spellEnd"/>
-      <w:r>
-        <w:rPr>
-          <w:lang w:val="es-MX"/>
-        </w:rPr>
-        <w:t xml:space="preserve"> o con </w:t>
-      </w:r>
-      <w:proofErr w:type="spellStart"/>
-      <w:r>
-        <w:rPr>
-          <w:lang w:val="es-MX"/>
-        </w:rPr>
-        <w:t>fiserv</w:t>
-      </w:r>
-      <w:proofErr w:type="spellEnd"/>
-      <w:r>
-        <w:rPr>
-          <w:lang w:val="es-MX"/>
-        </w:rPr>
-        <w:t>)</w:t>
-      </w:r>
-    </w:p>
-    <w:p>
-      <w:pPr>
-        <w:rPr>
-          <w:lang w:val="es-MX"/>
-        </w:rPr>
-      </w:pPr>
-    </w:p>
-    <w:p>
-      <w:pPr>
-        <w:rPr>
-          <w:b/>
-          <w:lang w:val="es-MX"/>
-        </w:rPr>
-      </w:pPr>
-      <w:r>
-        <w:rPr>
-          <w:b/>
-          <w:lang w:val="es-MX"/>
-        </w:rPr>
-        <w:t>DASHBOARD PARA SUPERVISORAS</w:t>
-      </w:r>
-    </w:p>
-    <w:p>
-      <w:pPr>
-        <w:rPr>
-          <w:lang w:val="es-MX"/>
-        </w:rPr>
-      </w:pPr>
-      <w:r>
-        <w:rPr>
-          <w:lang w:val="es-MX"/>
-        </w:rPr>
-        <w:lastRenderedPageBreak/>
-        <w:t>Indicadores propios a definir x Rocío</w:t>
-      </w:r>
     </w:p>
     <w:sectPr>
       <w:pgSz w:w="12240" w:h="15840"/>

</xml_diff>

<commit_message>
cambios en reporte nuevo modelo joyería
</commit_message>
<xml_diff>
--- a/Cambios a Reportes.docx
+++ b/Cambios a Reportes.docx
@@ -179,431 +179,458 @@
           <w:lang w:val="es-MX"/>
         </w:rPr>
       </w:pPr>
-    </w:p>
-    <w:p>
-      <w:pPr>
-        <w:rPr>
-          <w:lang w:val="es-MX"/>
-        </w:rPr>
-      </w:pPr>
-    </w:p>
-    <w:p>
-      <w:pPr>
-        <w:rPr>
-          <w:b/>
-          <w:lang w:val="es-MX"/>
-        </w:rPr>
-      </w:pPr>
-      <w:r>
-        <w:rPr>
-          <w:b/>
-          <w:lang w:val="es-MX"/>
-        </w:rPr>
-        <w:t>DASHBOARD:</w:t>
-      </w:r>
-    </w:p>
-    <w:p>
-      <w:pPr>
-        <w:rPr>
-          <w:lang w:val="es-MX"/>
-        </w:rPr>
-      </w:pPr>
-      <w:r>
-        <w:rPr>
-          <w:lang w:val="es-MX"/>
-        </w:rPr>
-        <w:t xml:space="preserve">Voy a tener que usar los costos actualizados hacia atrás. Me va a avisar Rocío cuando lo tenga listo en </w:t>
-      </w:r>
-      <w:proofErr w:type="spellStart"/>
-      <w:r>
-        <w:rPr>
-          <w:lang w:val="es-MX"/>
-        </w:rPr>
-        <w:t>Odoo</w:t>
-      </w:r>
-      <w:proofErr w:type="spellEnd"/>
-    </w:p>
-    <w:p>
-      <w:pPr>
-        <w:rPr>
-          <w:lang w:val="es-MX"/>
-        </w:rPr>
-      </w:pPr>
-      <w:proofErr w:type="spellStart"/>
-      <w:r>
-        <w:rPr>
-          <w:lang w:val="es-MX"/>
-        </w:rPr>
-        <w:t>Pack</w:t>
-      </w:r>
-      <w:r>
-        <w:rPr>
-          <w:lang w:val="es-MX"/>
-        </w:rPr>
-        <w:t>aging</w:t>
-      </w:r>
-      <w:proofErr w:type="spellEnd"/>
-      <w:r>
-        <w:rPr>
-          <w:lang w:val="es-MX"/>
-        </w:rPr>
-        <w:t>: Ro va a ver con las chicas los remitos para poder hacer el cálculo con el inventario de Roxana</w:t>
-      </w:r>
-    </w:p>
-    <w:p>
-      <w:pPr>
-        <w:rPr>
-          <w:lang w:val="es-MX"/>
-        </w:rPr>
-      </w:pPr>
-      <w:r>
-        <w:rPr>
-          <w:lang w:val="es-MX"/>
-        </w:rPr>
-        <w:t>Servicios: cambiarle el nombre x Gastos extraordinarios y ver si puedo ponerle un comentario para que se sepa de qué se trata</w:t>
-      </w:r>
-    </w:p>
-    <w:p>
-      <w:pPr>
-        <w:rPr>
-          <w:lang w:val="es-MX"/>
-        </w:rPr>
-      </w:pPr>
-      <w:r>
-        <w:rPr>
-          <w:lang w:val="es-MX"/>
-        </w:rPr>
-        <w:t>Incentivo (sueldos)</w:t>
-      </w:r>
-      <w:r>
-        <w:rPr>
-          <w:lang w:val="es-MX"/>
-        </w:rPr>
-        <w:t>: llamarlo Premio x venta y una parte sale de los recibos de sueldo. La otra parte pedir a Silvina (</w:t>
-      </w:r>
-      <w:r>
-        <w:rPr>
-          <w:lang w:val="es-MX"/>
-        </w:rPr>
-        <w:t>lo que se paga por afuera a las encargadas, no supervisoras)</w:t>
-      </w:r>
-      <w:r>
-        <w:rPr>
-          <w:lang w:val="es-MX"/>
-        </w:rPr>
-        <w:t xml:space="preserve"> SUMAR ESTO AL </w:t>
-      </w:r>
-      <w:r>
-        <w:rPr>
-          <w:b/>
-          <w:lang w:val="es-MX"/>
-        </w:rPr>
-        <w:t>REPORTE DE GASTOS</w:t>
-      </w:r>
-      <w:r>
-        <w:rPr>
-          <w:lang w:val="es-MX"/>
-        </w:rPr>
-        <w:t xml:space="preserve"> (DISCRIMINANDO INCENTIVO DE SUELDO)</w:t>
-      </w:r>
-    </w:p>
-    <w:p>
-      <w:pPr>
-        <w:rPr>
-          <w:lang w:val="es-MX"/>
-        </w:rPr>
-      </w:pPr>
-      <w:r>
-        <w:rPr>
-          <w:highlight w:val="yellow"/>
-          <w:lang w:val="es-MX"/>
-        </w:rPr>
-        <w:t>Revisar los sueldos que ante = cantidad de horas dan más altos en abril</w:t>
-      </w:r>
-    </w:p>
-    <w:p>
-      <w:pPr>
-        <w:rPr>
-          <w:lang w:val="es-MX"/>
-        </w:rPr>
-      </w:pPr>
-      <w:r>
-        <w:rPr>
-          <w:lang w:val="es-MX"/>
-        </w:rPr>
-        <w:t>Eliminar el gasto del vidrio de AS San Telmo</w:t>
-      </w:r>
-    </w:p>
-    <w:p>
-      <w:pPr>
-        <w:rPr>
-          <w:lang w:val="es-MX"/>
-        </w:rPr>
-      </w:pPr>
-    </w:p>
-    <w:p>
-      <w:pPr>
-        <w:rPr>
-          <w:lang w:val="es-MX"/>
-        </w:rPr>
-      </w:pPr>
-    </w:p>
-    <w:p>
-      <w:pPr>
-        <w:rPr>
-          <w:lang w:val="es-MX"/>
-        </w:rPr>
-      </w:pPr>
-    </w:p>
-    <w:p>
-      <w:pPr>
-        <w:rPr>
-          <w:b/>
-          <w:lang w:val="es-MX"/>
-        </w:rPr>
-      </w:pPr>
-      <w:r>
-        <w:rPr>
-          <w:b/>
-          <w:lang w:val="es-MX"/>
-        </w:rPr>
-        <w:t>REPORTE VENTAS</w:t>
-      </w:r>
-    </w:p>
-    <w:p>
-      <w:pPr>
-        <w:rPr>
-          <w:lang w:val="es-MX"/>
-        </w:rPr>
-      </w:pPr>
-      <w:r>
-        <w:rPr>
-          <w:lang w:val="es-MX"/>
-        </w:rPr>
-        <w:t xml:space="preserve">Agregar tabla de % ventas x medio de pago (ver si con </w:t>
-      </w:r>
-      <w:proofErr w:type="spellStart"/>
-      <w:r>
-        <w:rPr>
-          <w:lang w:val="es-MX"/>
-        </w:rPr>
-        <w:t>ODoo</w:t>
-      </w:r>
-      <w:proofErr w:type="spellEnd"/>
-      <w:r>
-        <w:rPr>
-          <w:lang w:val="es-MX"/>
-        </w:rPr>
-        <w:t xml:space="preserve"> o con </w:t>
-      </w:r>
-      <w:proofErr w:type="spellStart"/>
-      <w:r>
-        <w:rPr>
-          <w:lang w:val="es-MX"/>
-        </w:rPr>
-        <w:t>fiserv</w:t>
-      </w:r>
-      <w:proofErr w:type="spellEnd"/>
-      <w:r>
-        <w:rPr>
-          <w:lang w:val="es-MX"/>
-        </w:rPr>
-        <w:t>)</w:t>
-      </w:r>
-    </w:p>
-    <w:p>
-      <w:pPr>
-        <w:rPr>
-          <w:lang w:val="es-MX"/>
-        </w:rPr>
-      </w:pPr>
-    </w:p>
-    <w:p>
-      <w:pPr>
-        <w:rPr>
-          <w:b/>
-          <w:lang w:val="es-MX"/>
-        </w:rPr>
-      </w:pPr>
-      <w:r>
-        <w:rPr>
-          <w:b/>
-          <w:lang w:val="es-MX"/>
-        </w:rPr>
-        <w:t>DASHBOARD PARA SUPERVISORAS</w:t>
-      </w:r>
-    </w:p>
-    <w:p>
-      <w:pPr>
-        <w:rPr>
-          <w:b/>
-          <w:lang w:val="es-MX"/>
-        </w:rPr>
-      </w:pPr>
-      <w:r>
-        <w:rPr>
-          <w:lang w:val="es-MX"/>
-        </w:rPr>
-        <w:lastRenderedPageBreak/>
-        <w:t>Indicadores propios a definir x Rocío</w:t>
-      </w:r>
-      <w:r>
-        <w:rPr>
-          <w:lang w:val="es-MX"/>
-        </w:rPr>
-        <w:br/>
-      </w:r>
-      <w:r>
-        <w:rPr>
-          <w:lang w:val="es-MX"/>
-        </w:rPr>
-        <w:br/>
-      </w:r>
-      <w:r>
-        <w:rPr>
-          <w:b/>
-          <w:lang w:val="es-MX"/>
-        </w:rPr>
-        <w:t>DEBUTANTES</w:t>
-      </w:r>
-    </w:p>
-    <w:p>
-      <w:pPr>
-        <w:rPr>
-          <w:lang w:val="es-MX"/>
-        </w:rPr>
-      </w:pPr>
-      <w:r>
-        <w:rPr>
-          <w:lang w:val="es-MX"/>
-        </w:rPr>
-        <w:t xml:space="preserve">Rocío me va a pasar la lista. Crear un reporte con </w:t>
-      </w:r>
-      <w:proofErr w:type="spellStart"/>
-      <w:r>
-        <w:rPr>
-          <w:lang w:val="es-MX"/>
-        </w:rPr>
-        <w:t>table</w:t>
-      </w:r>
-      <w:proofErr w:type="spellEnd"/>
-      <w:r>
-        <w:rPr>
-          <w:lang w:val="es-MX"/>
-        </w:rPr>
-        <w:t xml:space="preserve"> semanal de ventas</w:t>
-      </w:r>
-    </w:p>
-    <w:p>
-      <w:pPr>
-        <w:rPr>
-          <w:lang w:val="es-MX"/>
-        </w:rPr>
-      </w:pPr>
-    </w:p>
-    <w:p>
-      <w:pPr>
-        <w:rPr>
-          <w:b/>
-          <w:lang w:val="es-MX"/>
-        </w:rPr>
-      </w:pPr>
-      <w:r>
-        <w:rPr>
-          <w:b/>
-          <w:lang w:val="es-MX"/>
-        </w:rPr>
-        <w:t>VENTA</w:t>
-      </w:r>
-      <w:r>
-        <w:rPr>
-          <w:b/>
-          <w:lang w:val="es-MX"/>
-        </w:rPr>
-        <w:t>S DE JOYERÍA ACUMULADA</w:t>
-      </w:r>
-    </w:p>
-    <w:p>
-      <w:pPr>
-        <w:rPr>
-          <w:lang w:val="es-MX"/>
-        </w:rPr>
-      </w:pPr>
-      <w:r>
-        <w:rPr>
-          <w:lang w:val="es-MX"/>
-        </w:rPr>
-        <w:t xml:space="preserve">Repetir el reporte de </w:t>
-      </w:r>
-      <w:proofErr w:type="gramStart"/>
-      <w:r>
-        <w:rPr>
-          <w:lang w:val="es-MX"/>
-        </w:rPr>
-        <w:t>Joyería</w:t>
-      </w:r>
-      <w:proofErr w:type="gramEnd"/>
-      <w:r>
-        <w:rPr>
-          <w:lang w:val="es-MX"/>
-        </w:rPr>
-        <w:t xml:space="preserve"> pero con datos acumulados desde el </w:t>
-      </w:r>
-      <w:proofErr w:type="spellStart"/>
-      <w:r>
-        <w:rPr>
-          <w:lang w:val="es-MX"/>
-        </w:rPr>
-        <w:t>ppio</w:t>
-      </w:r>
-      <w:proofErr w:type="spellEnd"/>
-      <w:r>
-        <w:rPr>
-          <w:lang w:val="es-MX"/>
-        </w:rPr>
-        <w:t xml:space="preserve"> hasta el día de realización del reporte</w:t>
-      </w:r>
-      <w:r>
-        <w:rPr>
-          <w:lang w:val="es-MX"/>
-        </w:rPr>
-        <w:t>.</w:t>
-      </w:r>
-    </w:p>
-    <w:p>
-      <w:pPr>
-        <w:rPr>
-          <w:lang w:val="es-MX"/>
-        </w:rPr>
-      </w:pPr>
-      <w:r>
-        <w:rPr>
-          <w:lang w:val="es-MX"/>
-        </w:rPr>
-        <w:t>No va la hoja de stock sin venta</w:t>
-      </w:r>
-    </w:p>
-    <w:p>
-      <w:pPr>
-        <w:rPr>
-          <w:lang w:val="es-MX"/>
-        </w:rPr>
-      </w:pPr>
-    </w:p>
-    <w:p>
-      <w:pPr>
-        <w:rPr>
-          <w:lang w:val="es-MX"/>
-        </w:rPr>
-      </w:pPr>
-      <w:r>
-        <w:rPr>
-          <w:lang w:val="es-MX"/>
-        </w:rPr>
-        <w:t>COMMIT</w:t>
+      <w:r>
+        <w:rPr>
+          <w:lang w:val="es-MX"/>
+        </w:rPr>
+        <w:t>Proveedores: revisar gráfico (sin subtotales) y en orden correcto (de &gt; a &lt; facturación x familia)</w:t>
+      </w:r>
+    </w:p>
+    <w:p>
+      <w:pPr>
+        <w:rPr>
+          <w:lang w:val="es-MX"/>
+        </w:rPr>
+      </w:pPr>
+      <w:r>
+        <w:rPr>
+          <w:lang w:val="es-MX"/>
+        </w:rPr>
+        <w:t>Ajustar el sombreado del 80% en las tablas de atributos. Ahora quedan demasiadas filas sombreadas.</w:t>
       </w:r>
       <w:bookmarkStart w:id="0" w:name="_GoBack"/>
       <w:bookmarkEnd w:id="0"/>
+    </w:p>
+    <w:p>
+      <w:pPr>
+        <w:rPr>
+          <w:lang w:val="es-MX"/>
+        </w:rPr>
+      </w:pPr>
+      <w:r>
+        <w:rPr>
+          <w:lang w:val="es-MX"/>
+        </w:rPr>
+        <w:t>VER CÓMO IDENTIFICAR LOS SALDOS DE LOS ANTICIPOS PARA TOMARLOS CON PRECIO COMPLETO YA QUE EL ANTICIPO SE BORRA.</w:t>
+      </w:r>
+    </w:p>
+    <w:p>
+      <w:pPr>
+        <w:rPr>
+          <w:lang w:val="es-MX"/>
+        </w:rPr>
+      </w:pPr>
+    </w:p>
+    <w:p>
+      <w:pPr>
+        <w:rPr>
+          <w:b/>
+          <w:lang w:val="es-MX"/>
+        </w:rPr>
+      </w:pPr>
+      <w:r>
+        <w:rPr>
+          <w:b/>
+          <w:lang w:val="es-MX"/>
+        </w:rPr>
+        <w:t>VENTAS DE JOYERÍA ACUMULADA</w:t>
+      </w:r>
+    </w:p>
+    <w:p>
+      <w:pPr>
+        <w:rPr>
+          <w:lang w:val="es-MX"/>
+        </w:rPr>
+      </w:pPr>
+      <w:r>
+        <w:rPr>
+          <w:lang w:val="es-MX"/>
+        </w:rPr>
+        <w:t xml:space="preserve">Repetir el reporte de </w:t>
+      </w:r>
+      <w:proofErr w:type="gramStart"/>
+      <w:r>
+        <w:rPr>
+          <w:lang w:val="es-MX"/>
+        </w:rPr>
+        <w:t>Joyería</w:t>
+      </w:r>
+      <w:proofErr w:type="gramEnd"/>
+      <w:r>
+        <w:rPr>
+          <w:lang w:val="es-MX"/>
+        </w:rPr>
+        <w:t xml:space="preserve"> pero con datos acumulados desde el </w:t>
+      </w:r>
+      <w:proofErr w:type="spellStart"/>
+      <w:r>
+        <w:rPr>
+          <w:lang w:val="es-MX"/>
+        </w:rPr>
+        <w:t>ppio</w:t>
+      </w:r>
+      <w:proofErr w:type="spellEnd"/>
+      <w:r>
+        <w:rPr>
+          <w:lang w:val="es-MX"/>
+        </w:rPr>
+        <w:t xml:space="preserve"> hasta el día de realización del reporte.</w:t>
+      </w:r>
+    </w:p>
+    <w:p>
+      <w:pPr>
+        <w:rPr>
+          <w:lang w:val="es-MX"/>
+        </w:rPr>
+      </w:pPr>
+      <w:r>
+        <w:rPr>
+          <w:lang w:val="es-MX"/>
+        </w:rPr>
+        <w:t>No va la hoja de stock sin venta</w:t>
+      </w:r>
+    </w:p>
+    <w:p>
+      <w:pPr>
+        <w:rPr>
+          <w:lang w:val="es-MX"/>
+        </w:rPr>
+      </w:pPr>
+    </w:p>
+    <w:p>
+      <w:pPr>
+        <w:rPr>
+          <w:b/>
+          <w:lang w:val="es-MX"/>
+        </w:rPr>
+      </w:pPr>
+    </w:p>
+    <w:p>
+      <w:pPr>
+        <w:rPr>
+          <w:b/>
+          <w:lang w:val="es-MX"/>
+        </w:rPr>
+      </w:pPr>
+      <w:r>
+        <w:rPr>
+          <w:b/>
+          <w:lang w:val="es-MX"/>
+        </w:rPr>
+        <w:t>DASHBOARD:</w:t>
+      </w:r>
+    </w:p>
+    <w:p>
+      <w:pPr>
+        <w:rPr>
+          <w:lang w:val="es-MX"/>
+        </w:rPr>
+      </w:pPr>
+      <w:r>
+        <w:rPr>
+          <w:lang w:val="es-MX"/>
+        </w:rPr>
+        <w:t xml:space="preserve">Voy a tener que usar los costos actualizados hacia atrás. Me va a avisar Rocío cuando lo tenga listo en </w:t>
+      </w:r>
+      <w:proofErr w:type="spellStart"/>
+      <w:r>
+        <w:rPr>
+          <w:lang w:val="es-MX"/>
+        </w:rPr>
+        <w:t>Odoo</w:t>
+      </w:r>
+      <w:proofErr w:type="spellEnd"/>
+    </w:p>
+    <w:p>
+      <w:pPr>
+        <w:rPr>
+          <w:lang w:val="es-MX"/>
+        </w:rPr>
+      </w:pPr>
+      <w:proofErr w:type="spellStart"/>
+      <w:r>
+        <w:rPr>
+          <w:lang w:val="es-MX"/>
+        </w:rPr>
+        <w:t>Pack</w:t>
+      </w:r>
+      <w:r>
+        <w:rPr>
+          <w:lang w:val="es-MX"/>
+        </w:rPr>
+        <w:t>aging</w:t>
+      </w:r>
+      <w:proofErr w:type="spellEnd"/>
+      <w:r>
+        <w:rPr>
+          <w:lang w:val="es-MX"/>
+        </w:rPr>
+        <w:t>: Ro va a ver con las chicas los remitos para poder hacer el cálculo con el inventario de Roxana</w:t>
+      </w:r>
+    </w:p>
+    <w:p>
+      <w:pPr>
+        <w:rPr>
+          <w:lang w:val="es-MX"/>
+        </w:rPr>
+      </w:pPr>
+      <w:r>
+        <w:rPr>
+          <w:lang w:val="es-MX"/>
+        </w:rPr>
+        <w:t>Servicios: cambiarle el nombre x Gastos extraordinarios y ver si puedo ponerle un comentario para que se sepa de qué se trata</w:t>
+      </w:r>
+    </w:p>
+    <w:p>
+      <w:pPr>
+        <w:rPr>
+          <w:lang w:val="es-MX"/>
+        </w:rPr>
+      </w:pPr>
+      <w:r>
+        <w:rPr>
+          <w:lang w:val="es-MX"/>
+        </w:rPr>
+        <w:t>Incentivo (sueldos)</w:t>
+      </w:r>
+      <w:r>
+        <w:rPr>
+          <w:lang w:val="es-MX"/>
+        </w:rPr>
+        <w:t>: llamarlo Premio x venta y una parte sale de los recibos de sueldo. La otra parte pedir a Silvina (</w:t>
+      </w:r>
+      <w:r>
+        <w:rPr>
+          <w:lang w:val="es-MX"/>
+        </w:rPr>
+        <w:t>lo que se paga por afuera a las encargadas, no supervisoras)</w:t>
+      </w:r>
+      <w:r>
+        <w:rPr>
+          <w:lang w:val="es-MX"/>
+        </w:rPr>
+        <w:t xml:space="preserve"> SUMAR ESTO AL </w:t>
+      </w:r>
+      <w:r>
+        <w:rPr>
+          <w:b/>
+          <w:lang w:val="es-MX"/>
+        </w:rPr>
+        <w:t>REPORTE DE GASTOS</w:t>
+      </w:r>
+      <w:r>
+        <w:rPr>
+          <w:lang w:val="es-MX"/>
+        </w:rPr>
+        <w:t xml:space="preserve"> (DISCRIMINANDO INCENTIVO DE SUELDO)</w:t>
+      </w:r>
+    </w:p>
+    <w:p>
+      <w:pPr>
+        <w:rPr>
+          <w:lang w:val="es-MX"/>
+        </w:rPr>
+      </w:pPr>
+      <w:r>
+        <w:rPr>
+          <w:highlight w:val="yellow"/>
+          <w:lang w:val="es-MX"/>
+        </w:rPr>
+        <w:lastRenderedPageBreak/>
+        <w:t>Revisar los sueldos que ante = cantidad de horas dan más altos en abril</w:t>
+      </w:r>
+    </w:p>
+    <w:p>
+      <w:pPr>
+        <w:rPr>
+          <w:lang w:val="es-MX"/>
+        </w:rPr>
+      </w:pPr>
+      <w:r>
+        <w:rPr>
+          <w:lang w:val="es-MX"/>
+        </w:rPr>
+        <w:t>Eliminar el gasto del vidrio de AS San Telmo</w:t>
+      </w:r>
+    </w:p>
+    <w:p>
+      <w:pPr>
+        <w:rPr>
+          <w:lang w:val="es-MX"/>
+        </w:rPr>
+      </w:pPr>
+    </w:p>
+    <w:p>
+      <w:pPr>
+        <w:rPr>
+          <w:lang w:val="es-MX"/>
+        </w:rPr>
+      </w:pPr>
+    </w:p>
+    <w:p>
+      <w:pPr>
+        <w:rPr>
+          <w:lang w:val="es-MX"/>
+        </w:rPr>
+      </w:pPr>
+    </w:p>
+    <w:p>
+      <w:pPr>
+        <w:rPr>
+          <w:b/>
+          <w:lang w:val="es-MX"/>
+        </w:rPr>
+      </w:pPr>
+      <w:r>
+        <w:rPr>
+          <w:b/>
+          <w:lang w:val="es-MX"/>
+        </w:rPr>
+        <w:t>REPORTE VENTAS</w:t>
+      </w:r>
+    </w:p>
+    <w:p>
+      <w:pPr>
+        <w:rPr>
+          <w:lang w:val="es-MX"/>
+        </w:rPr>
+      </w:pPr>
+      <w:r>
+        <w:rPr>
+          <w:lang w:val="es-MX"/>
+        </w:rPr>
+        <w:t xml:space="preserve">Agregar tabla de % ventas x medio de pago (ver si con </w:t>
+      </w:r>
+      <w:proofErr w:type="spellStart"/>
+      <w:r>
+        <w:rPr>
+          <w:lang w:val="es-MX"/>
+        </w:rPr>
+        <w:t>ODoo</w:t>
+      </w:r>
+      <w:proofErr w:type="spellEnd"/>
+      <w:r>
+        <w:rPr>
+          <w:lang w:val="es-MX"/>
+        </w:rPr>
+        <w:t xml:space="preserve"> o con </w:t>
+      </w:r>
+      <w:proofErr w:type="spellStart"/>
+      <w:r>
+        <w:rPr>
+          <w:lang w:val="es-MX"/>
+        </w:rPr>
+        <w:t>fiserv</w:t>
+      </w:r>
+      <w:proofErr w:type="spellEnd"/>
+      <w:r>
+        <w:rPr>
+          <w:lang w:val="es-MX"/>
+        </w:rPr>
+        <w:t>)</w:t>
+      </w:r>
+    </w:p>
+    <w:p>
+      <w:pPr>
+        <w:rPr>
+          <w:lang w:val="es-MX"/>
+        </w:rPr>
+      </w:pPr>
+    </w:p>
+    <w:p>
+      <w:pPr>
+        <w:rPr>
+          <w:b/>
+          <w:lang w:val="es-MX"/>
+        </w:rPr>
+      </w:pPr>
+      <w:r>
+        <w:rPr>
+          <w:b/>
+          <w:lang w:val="es-MX"/>
+        </w:rPr>
+        <w:t>DASHBOARD PARA SUPERVISORAS</w:t>
+      </w:r>
+    </w:p>
+    <w:p>
+      <w:pPr>
+        <w:rPr>
+          <w:b/>
+          <w:lang w:val="es-MX"/>
+        </w:rPr>
+      </w:pPr>
+      <w:r>
+        <w:rPr>
+          <w:lang w:val="es-MX"/>
+        </w:rPr>
+        <w:t>Indicadores propios a definir x Rocío</w:t>
+      </w:r>
+      <w:r>
+        <w:rPr>
+          <w:lang w:val="es-MX"/>
+        </w:rPr>
+        <w:br/>
+      </w:r>
+      <w:r>
+        <w:rPr>
+          <w:lang w:val="es-MX"/>
+        </w:rPr>
+        <w:br/>
+      </w:r>
+      <w:r>
+        <w:rPr>
+          <w:b/>
+          <w:lang w:val="es-MX"/>
+        </w:rPr>
+        <w:t>DEBUTANTES</w:t>
+      </w:r>
+    </w:p>
+    <w:p>
+      <w:pPr>
+        <w:rPr>
+          <w:lang w:val="es-MX"/>
+        </w:rPr>
+      </w:pPr>
+      <w:r>
+        <w:rPr>
+          <w:lang w:val="es-MX"/>
+        </w:rPr>
+        <w:t xml:space="preserve">Rocío me va a pasar la lista. Crear un reporte con </w:t>
+      </w:r>
+      <w:proofErr w:type="spellStart"/>
+      <w:r>
+        <w:rPr>
+          <w:lang w:val="es-MX"/>
+        </w:rPr>
+        <w:t>table</w:t>
+      </w:r>
+      <w:proofErr w:type="spellEnd"/>
+      <w:r>
+        <w:rPr>
+          <w:lang w:val="es-MX"/>
+        </w:rPr>
+        <w:t xml:space="preserve"> semanal de ventas</w:t>
+      </w:r>
+    </w:p>
+    <w:p>
+      <w:pPr>
+        <w:rPr>
+          <w:lang w:val="es-MX"/>
+        </w:rPr>
+      </w:pPr>
+    </w:p>
+    <w:p>
+      <w:pPr>
+        <w:rPr>
+          <w:lang w:val="es-MX"/>
+        </w:rPr>
+      </w:pPr>
+      <w:r>
+        <w:rPr>
+          <w:lang w:val="es-MX"/>
+        </w:rPr>
+        <w:t>COMMIT</w:t>
+      </w:r>
     </w:p>
     <w:sectPr>
       <w:pgSz w:w="12240" w:h="15840"/>

</xml_diff>

<commit_message>
Add .gitattributes for consistent line endings across machines
</commit_message>
<xml_diff>
--- a/Cambios a Reportes.docx
+++ b/Cambios a Reportes.docx
@@ -1,6 +1,6 @@
 
 <file path=word/document.xml><?xml version="1.0" encoding="utf-8"?>
-<w:document xmlns:wpc="http://schemas.microsoft.com/office/word/2010/wordprocessingCanvas" xmlns:cx="http://schemas.microsoft.com/office/drawing/2014/chartex" xmlns:mc="http://schemas.openxmlformats.org/markup-compatibility/2006" xmlns:o="urn:schemas-microsoft-com:office:office" xmlns:r="http://schemas.openxmlformats.org/officeDocument/2006/relationships" xmlns:m="http://schemas.openxmlformats.org/officeDocument/2006/math" xmlns:v="urn:schemas-microsoft-com:vml" xmlns:wp14="http://schemas.microsoft.com/office/word/2010/wordprocessingDrawing" xmlns:wp="http://schemas.openxmlformats.org/drawingml/2006/wordprocessingDrawing" xmlns:w10="urn:schemas-microsoft-com:office:word" xmlns:w="http://schemas.openxmlformats.org/wordprocessingml/2006/main" xmlns:w14="http://schemas.microsoft.com/office/word/2010/wordml" xmlns:w15="http://schemas.microsoft.com/office/word/2012/wordml" xmlns:w16se="http://schemas.microsoft.com/office/word/2015/wordml/symex" xmlns:wpg="http://schemas.microsoft.com/office/word/2010/wordprocessingGroup" xmlns:wpi="http://schemas.microsoft.com/office/word/2010/wordprocessingInk" xmlns:wne="http://schemas.microsoft.com/office/word/2006/wordml" xmlns:wps="http://schemas.microsoft.com/office/word/2010/wordprocessingShape" mc:Ignorable="w14 w15 w16se wp14">
+<w:document xmlns:wpc="http://schemas.microsoft.com/office/word/2010/wordprocessingCanvas" xmlns:cx="http://schemas.microsoft.com/office/drawing/2014/chartex" xmlns:cx1="http://schemas.microsoft.com/office/drawing/2015/9/8/chartex" xmlns:mc="http://schemas.openxmlformats.org/markup-compatibility/2006" xmlns:o="urn:schemas-microsoft-com:office:office" xmlns:r="http://schemas.openxmlformats.org/officeDocument/2006/relationships" xmlns:m="http://schemas.openxmlformats.org/officeDocument/2006/math" xmlns:v="urn:schemas-microsoft-com:vml" xmlns:wp14="http://schemas.microsoft.com/office/word/2010/wordprocessingDrawing" xmlns:wp="http://schemas.openxmlformats.org/drawingml/2006/wordprocessingDrawing" xmlns:w10="urn:schemas-microsoft-com:office:word" xmlns:w="http://schemas.openxmlformats.org/wordprocessingml/2006/main" xmlns:w14="http://schemas.microsoft.com/office/word/2010/wordml" xmlns:w15="http://schemas.microsoft.com/office/word/2012/wordml" xmlns:w16se="http://schemas.microsoft.com/office/word/2015/wordml/symex" xmlns:wpg="http://schemas.microsoft.com/office/word/2010/wordprocessingGroup" xmlns:wpi="http://schemas.microsoft.com/office/word/2010/wordprocessingInk" xmlns:wne="http://schemas.microsoft.com/office/word/2006/wordml" xmlns:wps="http://schemas.microsoft.com/office/word/2010/wordprocessingShape" mc:Ignorable="w14 w15 w16se wp14">
   <w:body>
     <w:p>
       <w:pPr>
@@ -176,11 +176,13 @@
     <w:p>
       <w:pPr>
         <w:rPr>
-          <w:lang w:val="es-MX"/>
-        </w:rPr>
-      </w:pPr>
-      <w:r>
-        <w:rPr>
+          <w:highlight w:val="green"/>
+          <w:lang w:val="es-MX"/>
+        </w:rPr>
+      </w:pPr>
+      <w:r>
+        <w:rPr>
+          <w:highlight w:val="green"/>
           <w:lang w:val="es-MX"/>
         </w:rPr>
         <w:t>Proveedores: revisar gráfico (sin subtotales) y en orden correcto (de &gt; a &lt; facturación x familia)</w:t>
@@ -194,47 +196,48 @@
       </w:pPr>
       <w:r>
         <w:rPr>
+          <w:highlight w:val="green"/>
           <w:lang w:val="es-MX"/>
         </w:rPr>
         <w:t>Ajustar el sombreado del 80% en las tablas de atributos. Ahora quedan demasiadas filas sombreadas.</w:t>
+      </w:r>
+    </w:p>
+    <w:p>
+      <w:pPr>
+        <w:rPr>
+          <w:lang w:val="es-MX"/>
+        </w:rPr>
+      </w:pPr>
+      <w:r>
+        <w:rPr>
+          <w:lang w:val="es-MX"/>
+        </w:rPr>
+        <w:t>VER CÓMO IDENTIFICAR LOS SALDOS DE LOS ANTICIPOS PARA TOMARLOS CON PRECIO COMPLETO YA QUE EL ANTICIPO SE BORRA.</w:t>
+      </w:r>
+    </w:p>
+    <w:p>
+      <w:pPr>
+        <w:rPr>
+          <w:lang w:val="es-MX"/>
+        </w:rPr>
+      </w:pPr>
+    </w:p>
+    <w:p>
+      <w:pPr>
+        <w:rPr>
+          <w:b/>
+          <w:lang w:val="es-MX"/>
+        </w:rPr>
+      </w:pPr>
+      <w:r>
+        <w:rPr>
+          <w:b/>
+          <w:lang w:val="es-MX"/>
+        </w:rPr>
+        <w:t>VENTAS DE JOYERÍA ACUMULADA</w:t>
       </w:r>
       <w:bookmarkStart w:id="0" w:name="_GoBack"/>
       <w:bookmarkEnd w:id="0"/>
-    </w:p>
-    <w:p>
-      <w:pPr>
-        <w:rPr>
-          <w:lang w:val="es-MX"/>
-        </w:rPr>
-      </w:pPr>
-      <w:r>
-        <w:rPr>
-          <w:lang w:val="es-MX"/>
-        </w:rPr>
-        <w:t>VER CÓMO IDENTIFICAR LOS SALDOS DE LOS ANTICIPOS PARA TOMARLOS CON PRECIO COMPLETO YA QUE EL ANTICIPO SE BORRA.</w:t>
-      </w:r>
-    </w:p>
-    <w:p>
-      <w:pPr>
-        <w:rPr>
-          <w:lang w:val="es-MX"/>
-        </w:rPr>
-      </w:pPr>
-    </w:p>
-    <w:p>
-      <w:pPr>
-        <w:rPr>
-          <w:b/>
-          <w:lang w:val="es-MX"/>
-        </w:rPr>
-      </w:pPr>
-      <w:r>
-        <w:rPr>
-          <w:b/>
-          <w:lang w:val="es-MX"/>
-        </w:rPr>
-        <w:t>VENTAS DE JOYERÍA ACUMULADA</w:t>
-      </w:r>
     </w:p>
     <w:p>
       <w:pPr>

</xml_diff>

<commit_message>
Add .gitattributes to manage line endings
</commit_message>
<xml_diff>
--- a/Cambios a Reportes.docx
+++ b/Cambios a Reportes.docx
@@ -1,6 +1,6 @@
 
 <file path=word/document.xml><?xml version="1.0" encoding="utf-8"?>
-<w:document xmlns:wpc="http://schemas.microsoft.com/office/word/2010/wordprocessingCanvas" xmlns:cx="http://schemas.microsoft.com/office/drawing/2014/chartex" xmlns:cx1="http://schemas.microsoft.com/office/drawing/2015/9/8/chartex" xmlns:mc="http://schemas.openxmlformats.org/markup-compatibility/2006" xmlns:o="urn:schemas-microsoft-com:office:office" xmlns:r="http://schemas.openxmlformats.org/officeDocument/2006/relationships" xmlns:m="http://schemas.openxmlformats.org/officeDocument/2006/math" xmlns:v="urn:schemas-microsoft-com:vml" xmlns:wp14="http://schemas.microsoft.com/office/word/2010/wordprocessingDrawing" xmlns:wp="http://schemas.openxmlformats.org/drawingml/2006/wordprocessingDrawing" xmlns:w10="urn:schemas-microsoft-com:office:word" xmlns:w="http://schemas.openxmlformats.org/wordprocessingml/2006/main" xmlns:w14="http://schemas.microsoft.com/office/word/2010/wordml" xmlns:w15="http://schemas.microsoft.com/office/word/2012/wordml" xmlns:w16se="http://schemas.microsoft.com/office/word/2015/wordml/symex" xmlns:wpg="http://schemas.microsoft.com/office/word/2010/wordprocessingGroup" xmlns:wpi="http://schemas.microsoft.com/office/word/2010/wordprocessingInk" xmlns:wne="http://schemas.microsoft.com/office/word/2006/wordml" xmlns:wps="http://schemas.microsoft.com/office/word/2010/wordprocessingShape" mc:Ignorable="w14 w15 w16se wp14">
+<w:document xmlns:wpc="http://schemas.microsoft.com/office/word/2010/wordprocessingCanvas" xmlns:cx="http://schemas.microsoft.com/office/drawing/2014/chartex" xmlns:mc="http://schemas.openxmlformats.org/markup-compatibility/2006" xmlns:o="urn:schemas-microsoft-com:office:office" xmlns:r="http://schemas.openxmlformats.org/officeDocument/2006/relationships" xmlns:m="http://schemas.openxmlformats.org/officeDocument/2006/math" xmlns:v="urn:schemas-microsoft-com:vml" xmlns:wp14="http://schemas.microsoft.com/office/word/2010/wordprocessingDrawing" xmlns:wp="http://schemas.openxmlformats.org/drawingml/2006/wordprocessingDrawing" xmlns:w10="urn:schemas-microsoft-com:office:word" xmlns:w="http://schemas.openxmlformats.org/wordprocessingml/2006/main" xmlns:w14="http://schemas.microsoft.com/office/word/2010/wordml" xmlns:w15="http://schemas.microsoft.com/office/word/2012/wordml" xmlns:w16se="http://schemas.microsoft.com/office/word/2015/wordml/symex" xmlns:wpg="http://schemas.microsoft.com/office/word/2010/wordprocessingGroup" xmlns:wpi="http://schemas.microsoft.com/office/word/2010/wordprocessingInk" xmlns:wne="http://schemas.microsoft.com/office/word/2006/wordml" xmlns:wps="http://schemas.microsoft.com/office/word/2010/wordprocessingShape" mc:Ignorable="w14 w15 w16se wp14">
   <w:body>
     <w:p>
       <w:pPr>
@@ -236,337 +236,438 @@
         </w:rPr>
         <w:t>VENTAS DE JOYERÍA ACUMULADA</w:t>
       </w:r>
+    </w:p>
+    <w:p>
+      <w:pPr>
+        <w:rPr>
+          <w:lang w:val="es-MX"/>
+        </w:rPr>
+      </w:pPr>
+      <w:r>
+        <w:rPr>
+          <w:lang w:val="es-MX"/>
+        </w:rPr>
+        <w:t xml:space="preserve">Repetir el reporte de </w:t>
+      </w:r>
+      <w:proofErr w:type="gramStart"/>
+      <w:r>
+        <w:rPr>
+          <w:lang w:val="es-MX"/>
+        </w:rPr>
+        <w:t>Joyería</w:t>
+      </w:r>
+      <w:proofErr w:type="gramEnd"/>
+      <w:r>
+        <w:rPr>
+          <w:lang w:val="es-MX"/>
+        </w:rPr>
+        <w:t xml:space="preserve"> pero con datos acumulados desde el </w:t>
+      </w:r>
+      <w:proofErr w:type="spellStart"/>
+      <w:r>
+        <w:rPr>
+          <w:lang w:val="es-MX"/>
+        </w:rPr>
+        <w:t>ppio</w:t>
+      </w:r>
+      <w:proofErr w:type="spellEnd"/>
+      <w:r>
+        <w:rPr>
+          <w:lang w:val="es-MX"/>
+        </w:rPr>
+        <w:t xml:space="preserve"> hasta el día de realización del reporte.</w:t>
+      </w:r>
+    </w:p>
+    <w:p>
+      <w:pPr>
+        <w:rPr>
+          <w:lang w:val="es-MX"/>
+        </w:rPr>
+      </w:pPr>
+      <w:r>
+        <w:rPr>
+          <w:lang w:val="es-MX"/>
+        </w:rPr>
+        <w:t>No va la hoja de stock sin venta</w:t>
+      </w:r>
+    </w:p>
+    <w:p>
+      <w:pPr>
+        <w:rPr>
+          <w:lang w:val="es-MX"/>
+        </w:rPr>
+      </w:pPr>
+    </w:p>
+    <w:p>
+      <w:pPr>
+        <w:rPr>
+          <w:b/>
+          <w:lang w:val="es-MX"/>
+        </w:rPr>
+      </w:pPr>
+    </w:p>
+    <w:p>
+      <w:pPr>
+        <w:rPr>
+          <w:b/>
+          <w:lang w:val="es-MX"/>
+        </w:rPr>
+      </w:pPr>
+      <w:r>
+        <w:rPr>
+          <w:b/>
+          <w:lang w:val="es-MX"/>
+        </w:rPr>
+        <w:t>DASHBOARD:</w:t>
+      </w:r>
+    </w:p>
+    <w:p>
+      <w:pPr>
+        <w:rPr>
+          <w:lang w:val="es-MX"/>
+        </w:rPr>
+      </w:pPr>
+      <w:r>
+        <w:rPr>
+          <w:lang w:val="es-MX"/>
+        </w:rPr>
+        <w:t xml:space="preserve">Voy a tener que usar los costos actualizados hacia atrás. Me va a avisar Rocío cuando lo tenga listo en </w:t>
+      </w:r>
+      <w:proofErr w:type="spellStart"/>
+      <w:r>
+        <w:rPr>
+          <w:lang w:val="es-MX"/>
+        </w:rPr>
+        <w:t>Odoo</w:t>
+      </w:r>
+      <w:proofErr w:type="spellEnd"/>
+    </w:p>
+    <w:p>
+      <w:pPr>
+        <w:rPr>
+          <w:lang w:val="es-MX"/>
+        </w:rPr>
+      </w:pPr>
+      <w:proofErr w:type="spellStart"/>
+      <w:r>
+        <w:rPr>
+          <w:lang w:val="es-MX"/>
+        </w:rPr>
+        <w:t>Pack</w:t>
+      </w:r>
+      <w:r>
+        <w:rPr>
+          <w:lang w:val="es-MX"/>
+        </w:rPr>
+        <w:t>aging</w:t>
+      </w:r>
+      <w:proofErr w:type="spellEnd"/>
+      <w:r>
+        <w:rPr>
+          <w:lang w:val="es-MX"/>
+        </w:rPr>
+        <w:t>: Ro va a ver con las chicas los remitos para poder hacer el cálculo con el inventario de Roxana</w:t>
+      </w:r>
+    </w:p>
+    <w:p>
+      <w:pPr>
+        <w:rPr>
+          <w:lang w:val="es-MX"/>
+        </w:rPr>
+      </w:pPr>
+      <w:r>
+        <w:rPr>
+          <w:lang w:val="es-MX"/>
+        </w:rPr>
+        <w:t>Servicios: cambiarle el nombre x Gastos extraordinarios y ver si puedo ponerle un comentario para que se sepa de qué se trata</w:t>
+      </w:r>
+    </w:p>
+    <w:p>
+      <w:pPr>
+        <w:rPr>
+          <w:lang w:val="es-MX"/>
+        </w:rPr>
+      </w:pPr>
+      <w:r>
+        <w:rPr>
+          <w:lang w:val="es-MX"/>
+        </w:rPr>
+        <w:t>Incentivo (sueldos)</w:t>
+      </w:r>
+      <w:r>
+        <w:rPr>
+          <w:lang w:val="es-MX"/>
+        </w:rPr>
+        <w:t>: llamarlo Premio x venta y una parte sale de los recibos de sueldo. La otra parte pedir a Silvina (</w:t>
+      </w:r>
+      <w:r>
+        <w:rPr>
+          <w:lang w:val="es-MX"/>
+        </w:rPr>
+        <w:t>lo que se paga por afuera a las encargadas, no supervisoras)</w:t>
+      </w:r>
+      <w:r>
+        <w:rPr>
+          <w:lang w:val="es-MX"/>
+        </w:rPr>
+        <w:t xml:space="preserve"> SUMAR ESTO AL </w:t>
+      </w:r>
+      <w:r>
+        <w:rPr>
+          <w:b/>
+          <w:lang w:val="es-MX"/>
+        </w:rPr>
+        <w:t>REPORTE DE GASTOS</w:t>
+      </w:r>
+      <w:r>
+        <w:rPr>
+          <w:lang w:val="es-MX"/>
+        </w:rPr>
+        <w:t xml:space="preserve"> (DISCRIMINANDO INCENTIVO DE SUELDO)</w:t>
+      </w:r>
+    </w:p>
+    <w:p>
+      <w:pPr>
+        <w:rPr>
+          <w:lang w:val="es-MX"/>
+        </w:rPr>
+      </w:pPr>
+      <w:r>
+        <w:rPr>
+          <w:highlight w:val="yellow"/>
+          <w:lang w:val="es-MX"/>
+        </w:rPr>
+        <w:lastRenderedPageBreak/>
+        <w:t>Revisar los sueldos que ante = cantidad de horas dan más altos en abril</w:t>
+      </w:r>
+    </w:p>
+    <w:p>
+      <w:pPr>
+        <w:rPr>
+          <w:lang w:val="es-MX"/>
+        </w:rPr>
+      </w:pPr>
+      <w:r>
+        <w:rPr>
+          <w:lang w:val="es-MX"/>
+        </w:rPr>
+        <w:t>Eliminar el gasto del vidrio de AS San Telmo</w:t>
+      </w:r>
+    </w:p>
+    <w:p>
+      <w:pPr>
+        <w:rPr>
+          <w:lang w:val="es-MX"/>
+        </w:rPr>
+      </w:pPr>
+    </w:p>
+    <w:p>
+      <w:pPr>
+        <w:rPr>
+          <w:lang w:val="es-MX"/>
+        </w:rPr>
+      </w:pPr>
+    </w:p>
+    <w:p>
+      <w:pPr>
+        <w:rPr>
+          <w:lang w:val="es-MX"/>
+        </w:rPr>
+      </w:pPr>
+    </w:p>
+    <w:p>
+      <w:pPr>
+        <w:rPr>
+          <w:b/>
+          <w:lang w:val="es-MX"/>
+        </w:rPr>
+      </w:pPr>
+      <w:r>
+        <w:rPr>
+          <w:b/>
+          <w:lang w:val="es-MX"/>
+        </w:rPr>
+        <w:t>REPORTE VENTAS</w:t>
+      </w:r>
+    </w:p>
+    <w:p>
+      <w:pPr>
+        <w:rPr>
+          <w:lang w:val="es-MX"/>
+        </w:rPr>
+      </w:pPr>
+      <w:r>
+        <w:rPr>
+          <w:lang w:val="es-MX"/>
+        </w:rPr>
+        <w:t xml:space="preserve">Agregar tabla de % ventas x medio de pago (ver si con </w:t>
+      </w:r>
+      <w:proofErr w:type="spellStart"/>
+      <w:r>
+        <w:rPr>
+          <w:lang w:val="es-MX"/>
+        </w:rPr>
+        <w:t>ODoo</w:t>
+      </w:r>
+      <w:proofErr w:type="spellEnd"/>
+      <w:r>
+        <w:rPr>
+          <w:lang w:val="es-MX"/>
+        </w:rPr>
+        <w:t xml:space="preserve"> o con </w:t>
+      </w:r>
+      <w:proofErr w:type="spellStart"/>
+      <w:r>
+        <w:rPr>
+          <w:lang w:val="es-MX"/>
+        </w:rPr>
+        <w:t>fiserv</w:t>
+      </w:r>
+      <w:proofErr w:type="spellEnd"/>
+      <w:r>
+        <w:rPr>
+          <w:lang w:val="es-MX"/>
+        </w:rPr>
+        <w:t>)</w:t>
+      </w:r>
+    </w:p>
+    <w:p>
+      <w:pPr>
+        <w:rPr>
+          <w:lang w:val="es-MX"/>
+        </w:rPr>
+      </w:pPr>
+    </w:p>
+    <w:p>
+      <w:pPr>
+        <w:rPr>
+          <w:b/>
+          <w:lang w:val="es-MX"/>
+        </w:rPr>
+      </w:pPr>
+      <w:r>
+        <w:rPr>
+          <w:b/>
+          <w:lang w:val="es-MX"/>
+        </w:rPr>
+        <w:t>DASHBOARD PARA SUPERVISORAS</w:t>
+      </w:r>
+    </w:p>
+    <w:p>
+      <w:pPr>
+        <w:rPr>
+          <w:lang w:val="es-MX"/>
+        </w:rPr>
+      </w:pPr>
+      <w:r>
+        <w:rPr>
+          <w:lang w:val="es-MX"/>
+        </w:rPr>
+        <w:t>Indicadores propios a definir x Rocío</w:t>
+      </w:r>
+      <w:r>
+        <w:rPr>
+          <w:lang w:val="es-MX"/>
+        </w:rPr>
+        <w:br/>
+      </w:r>
+    </w:p>
+    <w:p>
+      <w:pPr>
+        <w:rPr>
+          <w:b/>
+          <w:lang w:val="es-MX"/>
+        </w:rPr>
+      </w:pPr>
+      <w:r>
+        <w:rPr>
+          <w:b/>
+          <w:lang w:val="es-MX"/>
+        </w:rPr>
+        <w:t>APP PARA SUPERVISORAS</w:t>
+      </w:r>
+    </w:p>
+    <w:p>
+      <w:pPr>
+        <w:rPr>
+          <w:b/>
+          <w:lang w:val="es-MX"/>
+        </w:rPr>
+      </w:pPr>
+      <w:r>
+        <w:rPr>
+          <w:lang w:val="es-MX"/>
+        </w:rPr>
+        <w:t>Para las horas trabajadas</w:t>
+      </w:r>
       <w:bookmarkStart w:id="0" w:name="_GoBack"/>
       <w:bookmarkEnd w:id="0"/>
-    </w:p>
-    <w:p>
-      <w:pPr>
-        <w:rPr>
-          <w:lang w:val="es-MX"/>
-        </w:rPr>
-      </w:pPr>
-      <w:r>
-        <w:rPr>
-          <w:lang w:val="es-MX"/>
-        </w:rPr>
-        <w:t xml:space="preserve">Repetir el reporte de </w:t>
-      </w:r>
-      <w:proofErr w:type="gramStart"/>
-      <w:r>
-        <w:rPr>
-          <w:lang w:val="es-MX"/>
-        </w:rPr>
-        <w:t>Joyería</w:t>
-      </w:r>
-      <w:proofErr w:type="gramEnd"/>
-      <w:r>
-        <w:rPr>
-          <w:lang w:val="es-MX"/>
-        </w:rPr>
-        <w:t xml:space="preserve"> pero con datos acumulados desde el </w:t>
+      <w:r>
+        <w:rPr>
+          <w:lang w:val="es-MX"/>
+        </w:rPr>
+        <w:br/>
+      </w:r>
+    </w:p>
+    <w:p>
+      <w:pPr>
+        <w:rPr>
+          <w:b/>
+          <w:lang w:val="es-MX"/>
+        </w:rPr>
+      </w:pPr>
+      <w:r>
+        <w:rPr>
+          <w:b/>
+          <w:lang w:val="es-MX"/>
+        </w:rPr>
+        <w:t>DEBUTANTES</w:t>
+      </w:r>
+    </w:p>
+    <w:p>
+      <w:pPr>
+        <w:rPr>
+          <w:lang w:val="es-MX"/>
+        </w:rPr>
+      </w:pPr>
+      <w:r>
+        <w:rPr>
+          <w:lang w:val="es-MX"/>
+        </w:rPr>
+        <w:t xml:space="preserve">Rocío me va a pasar la lista. Crear un reporte con </w:t>
       </w:r>
       <w:proofErr w:type="spellStart"/>
       <w:r>
         <w:rPr>
           <w:lang w:val="es-MX"/>
         </w:rPr>
-        <w:t>ppio</w:t>
+        <w:t>table</w:t>
       </w:r>
       <w:proofErr w:type="spellEnd"/>
       <w:r>
         <w:rPr>
           <w:lang w:val="es-MX"/>
         </w:rPr>
-        <w:t xml:space="preserve"> hasta el día de realización del reporte.</w:t>
-      </w:r>
-    </w:p>
-    <w:p>
-      <w:pPr>
-        <w:rPr>
-          <w:lang w:val="es-MX"/>
-        </w:rPr>
-      </w:pPr>
-      <w:r>
-        <w:rPr>
-          <w:lang w:val="es-MX"/>
-        </w:rPr>
-        <w:t>No va la hoja de stock sin venta</w:t>
-      </w:r>
-    </w:p>
-    <w:p>
-      <w:pPr>
-        <w:rPr>
-          <w:lang w:val="es-MX"/>
-        </w:rPr>
-      </w:pPr>
-    </w:p>
-    <w:p>
-      <w:pPr>
-        <w:rPr>
-          <w:b/>
-          <w:lang w:val="es-MX"/>
-        </w:rPr>
-      </w:pPr>
-    </w:p>
-    <w:p>
-      <w:pPr>
-        <w:rPr>
-          <w:b/>
-          <w:lang w:val="es-MX"/>
-        </w:rPr>
-      </w:pPr>
-      <w:r>
-        <w:rPr>
-          <w:b/>
-          <w:lang w:val="es-MX"/>
-        </w:rPr>
-        <w:t>DASHBOARD:</w:t>
-      </w:r>
-    </w:p>
-    <w:p>
-      <w:pPr>
-        <w:rPr>
-          <w:lang w:val="es-MX"/>
-        </w:rPr>
-      </w:pPr>
-      <w:r>
-        <w:rPr>
-          <w:lang w:val="es-MX"/>
-        </w:rPr>
-        <w:t xml:space="preserve">Voy a tener que usar los costos actualizados hacia atrás. Me va a avisar Rocío cuando lo tenga listo en </w:t>
-      </w:r>
-      <w:proofErr w:type="spellStart"/>
-      <w:r>
-        <w:rPr>
-          <w:lang w:val="es-MX"/>
-        </w:rPr>
-        <w:t>Odoo</w:t>
-      </w:r>
-      <w:proofErr w:type="spellEnd"/>
-    </w:p>
-    <w:p>
-      <w:pPr>
-        <w:rPr>
-          <w:lang w:val="es-MX"/>
-        </w:rPr>
-      </w:pPr>
-      <w:proofErr w:type="spellStart"/>
-      <w:r>
-        <w:rPr>
-          <w:lang w:val="es-MX"/>
-        </w:rPr>
-        <w:t>Pack</w:t>
-      </w:r>
-      <w:r>
-        <w:rPr>
-          <w:lang w:val="es-MX"/>
-        </w:rPr>
-        <w:t>aging</w:t>
-      </w:r>
-      <w:proofErr w:type="spellEnd"/>
-      <w:r>
-        <w:rPr>
-          <w:lang w:val="es-MX"/>
-        </w:rPr>
-        <w:t>: Ro va a ver con las chicas los remitos para poder hacer el cálculo con el inventario de Roxana</w:t>
-      </w:r>
-    </w:p>
-    <w:p>
-      <w:pPr>
-        <w:rPr>
-          <w:lang w:val="es-MX"/>
-        </w:rPr>
-      </w:pPr>
-      <w:r>
-        <w:rPr>
-          <w:lang w:val="es-MX"/>
-        </w:rPr>
-        <w:t>Servicios: cambiarle el nombre x Gastos extraordinarios y ver si puedo ponerle un comentario para que se sepa de qué se trata</w:t>
-      </w:r>
-    </w:p>
-    <w:p>
-      <w:pPr>
-        <w:rPr>
-          <w:lang w:val="es-MX"/>
-        </w:rPr>
-      </w:pPr>
-      <w:r>
-        <w:rPr>
-          <w:lang w:val="es-MX"/>
-        </w:rPr>
-        <w:t>Incentivo (sueldos)</w:t>
-      </w:r>
-      <w:r>
-        <w:rPr>
-          <w:lang w:val="es-MX"/>
-        </w:rPr>
-        <w:t>: llamarlo Premio x venta y una parte sale de los recibos de sueldo. La otra parte pedir a Silvina (</w:t>
-      </w:r>
-      <w:r>
-        <w:rPr>
-          <w:lang w:val="es-MX"/>
-        </w:rPr>
-        <w:t>lo que se paga por afuera a las encargadas, no supervisoras)</w:t>
-      </w:r>
-      <w:r>
-        <w:rPr>
-          <w:lang w:val="es-MX"/>
-        </w:rPr>
-        <w:t xml:space="preserve"> SUMAR ESTO AL </w:t>
-      </w:r>
-      <w:r>
-        <w:rPr>
-          <w:b/>
-          <w:lang w:val="es-MX"/>
-        </w:rPr>
-        <w:t>REPORTE DE GASTOS</w:t>
-      </w:r>
-      <w:r>
-        <w:rPr>
-          <w:lang w:val="es-MX"/>
-        </w:rPr>
-        <w:t xml:space="preserve"> (DISCRIMINANDO INCENTIVO DE SUELDO)</w:t>
-      </w:r>
-    </w:p>
-    <w:p>
-      <w:pPr>
-        <w:rPr>
-          <w:lang w:val="es-MX"/>
-        </w:rPr>
-      </w:pPr>
-      <w:r>
-        <w:rPr>
-          <w:highlight w:val="yellow"/>
-          <w:lang w:val="es-MX"/>
-        </w:rPr>
-        <w:lastRenderedPageBreak/>
-        <w:t>Revisar los sueldos que ante = cantidad de horas dan más altos en abril</w:t>
-      </w:r>
-    </w:p>
-    <w:p>
-      <w:pPr>
-        <w:rPr>
-          <w:lang w:val="es-MX"/>
-        </w:rPr>
-      </w:pPr>
-      <w:r>
-        <w:rPr>
-          <w:lang w:val="es-MX"/>
-        </w:rPr>
-        <w:t>Eliminar el gasto del vidrio de AS San Telmo</w:t>
-      </w:r>
-    </w:p>
-    <w:p>
-      <w:pPr>
-        <w:rPr>
-          <w:lang w:val="es-MX"/>
-        </w:rPr>
-      </w:pPr>
-    </w:p>
-    <w:p>
-      <w:pPr>
-        <w:rPr>
-          <w:lang w:val="es-MX"/>
-        </w:rPr>
-      </w:pPr>
-    </w:p>
-    <w:p>
-      <w:pPr>
-        <w:rPr>
-          <w:lang w:val="es-MX"/>
-        </w:rPr>
-      </w:pPr>
-    </w:p>
-    <w:p>
-      <w:pPr>
-        <w:rPr>
-          <w:b/>
-          <w:lang w:val="es-MX"/>
-        </w:rPr>
-      </w:pPr>
-      <w:r>
-        <w:rPr>
-          <w:b/>
-          <w:lang w:val="es-MX"/>
-        </w:rPr>
-        <w:t>REPORTE VENTAS</w:t>
-      </w:r>
-    </w:p>
-    <w:p>
-      <w:pPr>
-        <w:rPr>
-          <w:lang w:val="es-MX"/>
-        </w:rPr>
-      </w:pPr>
-      <w:r>
-        <w:rPr>
-          <w:lang w:val="es-MX"/>
-        </w:rPr>
-        <w:t xml:space="preserve">Agregar tabla de % ventas x medio de pago (ver si con </w:t>
-      </w:r>
-      <w:proofErr w:type="spellStart"/>
-      <w:r>
-        <w:rPr>
-          <w:lang w:val="es-MX"/>
-        </w:rPr>
-        <w:t>ODoo</w:t>
-      </w:r>
-      <w:proofErr w:type="spellEnd"/>
-      <w:r>
-        <w:rPr>
-          <w:lang w:val="es-MX"/>
-        </w:rPr>
-        <w:t xml:space="preserve"> o con </w:t>
-      </w:r>
-      <w:proofErr w:type="spellStart"/>
-      <w:r>
-        <w:rPr>
-          <w:lang w:val="es-MX"/>
-        </w:rPr>
-        <w:t>fiserv</w:t>
-      </w:r>
-      <w:proofErr w:type="spellEnd"/>
-      <w:r>
-        <w:rPr>
-          <w:lang w:val="es-MX"/>
-        </w:rPr>
-        <w:t>)</w:t>
-      </w:r>
-    </w:p>
-    <w:p>
-      <w:pPr>
-        <w:rPr>
-          <w:lang w:val="es-MX"/>
-        </w:rPr>
-      </w:pPr>
-    </w:p>
-    <w:p>
-      <w:pPr>
-        <w:rPr>
-          <w:b/>
-          <w:lang w:val="es-MX"/>
-        </w:rPr>
-      </w:pPr>
-      <w:r>
-        <w:rPr>
-          <w:b/>
-          <w:lang w:val="es-MX"/>
-        </w:rPr>
-        <w:t>DASHBOARD PARA SUPERVISORAS</w:t>
-      </w:r>
-    </w:p>
-    <w:p>
-      <w:pPr>
-        <w:rPr>
-          <w:b/>
-          <w:lang w:val="es-MX"/>
-        </w:rPr>
-      </w:pPr>
-      <w:r>
-        <w:rPr>
-          <w:lang w:val="es-MX"/>
-        </w:rPr>
-        <w:t>Indicadores propios a definir x Rocío</w:t>
+        <w:t xml:space="preserve"> semanal de ventas</w:t>
+      </w:r>
+      <w:r>
+        <w:rPr>
+          <w:lang w:val="es-MX"/>
+        </w:rPr>
+        <w:t>.</w:t>
+      </w:r>
+    </w:p>
+    <w:p>
+      <w:pPr>
+        <w:rPr>
+          <w:lang w:val="es-MX"/>
+        </w:rPr>
+      </w:pPr>
+      <w:r>
+        <w:rPr>
+          <w:lang w:val="es-MX"/>
+        </w:rPr>
+        <w:t>Tienen que ser de los proveedores:</w:t>
       </w:r>
       <w:r>
         <w:rPr>
@@ -574,45 +675,220 @@
         </w:rPr>
         <w:br/>
       </w:r>
-      <w:r>
-        <w:rPr>
-          <w:lang w:val="es-MX"/>
-        </w:rPr>
-        <w:br/>
-      </w:r>
-      <w:r>
-        <w:rPr>
-          <w:b/>
-          <w:lang w:val="es-MX"/>
-        </w:rPr>
-        <w:t>DEBUTANTES</w:t>
-      </w:r>
-    </w:p>
-    <w:p>
-      <w:pPr>
-        <w:rPr>
-          <w:lang w:val="es-MX"/>
-        </w:rPr>
-      </w:pPr>
-      <w:r>
-        <w:rPr>
-          <w:lang w:val="es-MX"/>
-        </w:rPr>
-        <w:t xml:space="preserve">Rocío me va a pasar la lista. Crear un reporte con </w:t>
-      </w:r>
-      <w:proofErr w:type="spellStart"/>
-      <w:r>
-        <w:rPr>
-          <w:lang w:val="es-MX"/>
-        </w:rPr>
-        <w:t>table</w:t>
-      </w:r>
-      <w:proofErr w:type="spellEnd"/>
-      <w:r>
-        <w:rPr>
-          <w:lang w:val="es-MX"/>
-        </w:rPr>
-        <w:t xml:space="preserve"> semanal de ventas</w:t>
+    </w:p>
+    <w:tbl>
+      <w:tblPr>
+        <w:tblW w:w="3940" w:type="dxa"/>
+        <w:tblLook w:val="04A0" w:firstRow="1" w:lastRow="0" w:firstColumn="1" w:lastColumn="0" w:noHBand="0" w:noVBand="1"/>
+      </w:tblPr>
+      <w:tblGrid>
+        <w:gridCol w:w="3940"/>
+      </w:tblGrid>
+      <w:tr>
+        <w:trPr>
+          <w:trHeight w:val="290"/>
+        </w:trPr>
+        <w:tc>
+          <w:tcPr>
+            <w:tcW w:w="3940" w:type="dxa"/>
+            <w:tcBorders>
+              <w:top w:val="single" w:sz="4" w:space="0" w:color="DEE2E6"/>
+              <w:left w:val="single" w:sz="4" w:space="0" w:color="DEE2E6"/>
+              <w:bottom w:val="single" w:sz="4" w:space="0" w:color="DEE2E6"/>
+              <w:right w:val="single" w:sz="4" w:space="0" w:color="DEE2E6"/>
+            </w:tcBorders>
+            <w:shd w:val="clear" w:color="auto" w:fill="auto"/>
+            <w:noWrap/>
+            <w:vAlign w:val="bottom"/>
+            <w:hideMark/>
+          </w:tcPr>
+          <w:p>
+            <w:pPr>
+              <w:spacing w:after="0" w:line="240" w:lineRule="auto"/>
+              <w:rPr>
+                <w:rFonts w:ascii="Arial" w:eastAsia="Times New Roman" w:hAnsi="Arial" w:cs="Arial"/>
+                <w:color w:val="000000"/>
+                <w:sz w:val="20"/>
+                <w:szCs w:val="20"/>
+              </w:rPr>
+            </w:pPr>
+            <w:r>
+              <w:rPr>
+                <w:rFonts w:ascii="Arial" w:eastAsia="Times New Roman" w:hAnsi="Arial" w:cs="Arial"/>
+                <w:color w:val="000000"/>
+                <w:sz w:val="20"/>
+                <w:szCs w:val="20"/>
+              </w:rPr>
+              <w:t>FABIAN BILAVSKY</w:t>
+            </w:r>
+          </w:p>
+        </w:tc>
+      </w:tr>
+      <w:tr>
+        <w:trPr>
+          <w:trHeight w:val="290"/>
+        </w:trPr>
+        <w:tc>
+          <w:tcPr>
+            <w:tcW w:w="3940" w:type="dxa"/>
+            <w:tcBorders>
+              <w:top w:val="nil"/>
+              <w:left w:val="single" w:sz="4" w:space="0" w:color="DEE2E6"/>
+              <w:bottom w:val="single" w:sz="4" w:space="0" w:color="DEE2E6"/>
+              <w:right w:val="single" w:sz="4" w:space="0" w:color="DEE2E6"/>
+            </w:tcBorders>
+            <w:shd w:val="clear" w:color="auto" w:fill="auto"/>
+            <w:noWrap/>
+            <w:vAlign w:val="bottom"/>
+            <w:hideMark/>
+          </w:tcPr>
+          <w:p>
+            <w:pPr>
+              <w:spacing w:after="0" w:line="240" w:lineRule="auto"/>
+              <w:rPr>
+                <w:rFonts w:ascii="Arial" w:eastAsia="Times New Roman" w:hAnsi="Arial" w:cs="Arial"/>
+                <w:color w:val="000000"/>
+                <w:sz w:val="20"/>
+                <w:szCs w:val="20"/>
+              </w:rPr>
+            </w:pPr>
+            <w:r>
+              <w:rPr>
+                <w:rFonts w:ascii="Arial" w:eastAsia="Times New Roman" w:hAnsi="Arial" w:cs="Arial"/>
+                <w:color w:val="000000"/>
+                <w:sz w:val="20"/>
+                <w:szCs w:val="20"/>
+              </w:rPr>
+              <w:t>VICTOR BERENGARD</w:t>
+            </w:r>
+          </w:p>
+        </w:tc>
+      </w:tr>
+      <w:tr>
+        <w:trPr>
+          <w:trHeight w:val="290"/>
+        </w:trPr>
+        <w:tc>
+          <w:tcPr>
+            <w:tcW w:w="3940" w:type="dxa"/>
+            <w:tcBorders>
+              <w:top w:val="nil"/>
+              <w:left w:val="single" w:sz="4" w:space="0" w:color="DEE2E6"/>
+              <w:bottom w:val="single" w:sz="4" w:space="0" w:color="DEE2E6"/>
+              <w:right w:val="single" w:sz="4" w:space="0" w:color="DEE2E6"/>
+            </w:tcBorders>
+            <w:shd w:val="clear" w:color="auto" w:fill="auto"/>
+            <w:noWrap/>
+            <w:vAlign w:val="bottom"/>
+            <w:hideMark/>
+          </w:tcPr>
+          <w:p>
+            <w:pPr>
+              <w:spacing w:after="0" w:line="240" w:lineRule="auto"/>
+              <w:rPr>
+                <w:rFonts w:ascii="Arial" w:eastAsia="Times New Roman" w:hAnsi="Arial" w:cs="Arial"/>
+                <w:color w:val="000000"/>
+                <w:sz w:val="20"/>
+                <w:szCs w:val="20"/>
+              </w:rPr>
+            </w:pPr>
+            <w:r>
+              <w:rPr>
+                <w:rFonts w:ascii="Arial" w:eastAsia="Times New Roman" w:hAnsi="Arial" w:cs="Arial"/>
+                <w:color w:val="000000"/>
+                <w:sz w:val="20"/>
+                <w:szCs w:val="20"/>
+              </w:rPr>
+              <w:t>NORBERTO KORDICH</w:t>
+            </w:r>
+          </w:p>
+        </w:tc>
+      </w:tr>
+      <w:tr>
+        <w:trPr>
+          <w:trHeight w:val="290"/>
+        </w:trPr>
+        <w:tc>
+          <w:tcPr>
+            <w:tcW w:w="3940" w:type="dxa"/>
+            <w:tcBorders>
+              <w:top w:val="nil"/>
+              <w:left w:val="single" w:sz="4" w:space="0" w:color="DEE2E6"/>
+              <w:bottom w:val="single" w:sz="4" w:space="0" w:color="DEE2E6"/>
+              <w:right w:val="single" w:sz="4" w:space="0" w:color="DEE2E6"/>
+            </w:tcBorders>
+            <w:shd w:val="clear" w:color="auto" w:fill="auto"/>
+            <w:noWrap/>
+            <w:vAlign w:val="bottom"/>
+            <w:hideMark/>
+          </w:tcPr>
+          <w:p>
+            <w:pPr>
+              <w:spacing w:after="0" w:line="240" w:lineRule="auto"/>
+              <w:rPr>
+                <w:rFonts w:ascii="Arial" w:eastAsia="Times New Roman" w:hAnsi="Arial" w:cs="Arial"/>
+                <w:color w:val="000000"/>
+                <w:sz w:val="20"/>
+                <w:szCs w:val="20"/>
+              </w:rPr>
+            </w:pPr>
+            <w:r>
+              <w:rPr>
+                <w:rFonts w:ascii="Arial" w:eastAsia="Times New Roman" w:hAnsi="Arial" w:cs="Arial"/>
+                <w:color w:val="000000"/>
+                <w:sz w:val="20"/>
+                <w:szCs w:val="20"/>
+              </w:rPr>
+              <w:t>CDEI</w:t>
+            </w:r>
+          </w:p>
+        </w:tc>
+      </w:tr>
+    </w:tbl>
+    <w:p>
+      <w:pPr>
+        <w:rPr>
+          <w:lang w:val="es-MX"/>
+        </w:rPr>
+      </w:pPr>
+      <w:r>
+        <w:rPr>
+          <w:lang w:val="es-MX"/>
+        </w:rPr>
+        <w:t xml:space="preserve"> </w:t>
+      </w:r>
+    </w:p>
+    <w:p>
+      <w:pPr>
+        <w:rPr>
+          <w:lang w:val="es-MX"/>
+        </w:rPr>
+      </w:pPr>
+      <w:r>
+        <w:rPr>
+          <w:lang w:val="es-MX"/>
+        </w:rPr>
+        <w:t>Más algunos artículos puntuales de otros proveedores.</w:t>
+      </w:r>
+    </w:p>
+    <w:p>
+      <w:pPr>
+        <w:rPr>
+          <w:lang w:val="es-MX"/>
+        </w:rPr>
+      </w:pPr>
+    </w:p>
+    <w:p>
+      <w:pPr>
+        <w:rPr>
+          <w:lang w:val="es-MX"/>
+        </w:rPr>
+      </w:pPr>
+      <w:r>
+        <w:rPr>
+          <w:lang w:val="es-MX"/>
+        </w:rPr>
+        <w:t>Serían las mismas dos solapas SKU, Familias y Modelos</w:t>
       </w:r>
     </w:p>
     <w:p>

</xml_diff>

<commit_message>
Normaliza line endings, .gitattributes, actualiza reporte de gastos y crea reporte de debutantes de joyería
</commit_message>
<xml_diff>
--- a/Cambios a Reportes.docx
+++ b/Cambios a Reportes.docx
@@ -1,6 +1,6 @@
 
 <file path=word/document.xml><?xml version="1.0" encoding="utf-8"?>
-<w:document xmlns:wpc="http://schemas.microsoft.com/office/word/2010/wordprocessingCanvas" xmlns:cx="http://schemas.microsoft.com/office/drawing/2014/chartex" xmlns:mc="http://schemas.openxmlformats.org/markup-compatibility/2006" xmlns:o="urn:schemas-microsoft-com:office:office" xmlns:r="http://schemas.openxmlformats.org/officeDocument/2006/relationships" xmlns:m="http://schemas.openxmlformats.org/officeDocument/2006/math" xmlns:v="urn:schemas-microsoft-com:vml" xmlns:wp14="http://schemas.microsoft.com/office/word/2010/wordprocessingDrawing" xmlns:wp="http://schemas.openxmlformats.org/drawingml/2006/wordprocessingDrawing" xmlns:w10="urn:schemas-microsoft-com:office:word" xmlns:w="http://schemas.openxmlformats.org/wordprocessingml/2006/main" xmlns:w14="http://schemas.microsoft.com/office/word/2010/wordml" xmlns:w15="http://schemas.microsoft.com/office/word/2012/wordml" xmlns:w16se="http://schemas.microsoft.com/office/word/2015/wordml/symex" xmlns:wpg="http://schemas.microsoft.com/office/word/2010/wordprocessingGroup" xmlns:wpi="http://schemas.microsoft.com/office/word/2010/wordprocessingInk" xmlns:wne="http://schemas.microsoft.com/office/word/2006/wordml" xmlns:wps="http://schemas.microsoft.com/office/word/2010/wordprocessingShape" mc:Ignorable="w14 w15 w16se wp14">
+<w:document xmlns:wpc="http://schemas.microsoft.com/office/word/2010/wordprocessingCanvas" xmlns:cx="http://schemas.microsoft.com/office/drawing/2014/chartex" xmlns:cx1="http://schemas.microsoft.com/office/drawing/2015/9/8/chartex" xmlns:mc="http://schemas.openxmlformats.org/markup-compatibility/2006" xmlns:o="urn:schemas-microsoft-com:office:office" xmlns:r="http://schemas.openxmlformats.org/officeDocument/2006/relationships" xmlns:m="http://schemas.openxmlformats.org/officeDocument/2006/math" xmlns:v="urn:schemas-microsoft-com:vml" xmlns:wp14="http://schemas.microsoft.com/office/word/2010/wordprocessingDrawing" xmlns:wp="http://schemas.openxmlformats.org/drawingml/2006/wordprocessingDrawing" xmlns:w10="urn:schemas-microsoft-com:office:word" xmlns:w="http://schemas.openxmlformats.org/wordprocessingml/2006/main" xmlns:w14="http://schemas.microsoft.com/office/word/2010/wordml" xmlns:w15="http://schemas.microsoft.com/office/word/2012/wordml" xmlns:w16se="http://schemas.microsoft.com/office/word/2015/wordml/symex" xmlns:wpg="http://schemas.microsoft.com/office/word/2010/wordprocessingGroup" xmlns:wpi="http://schemas.microsoft.com/office/word/2010/wordprocessingInk" xmlns:wne="http://schemas.microsoft.com/office/word/2006/wordml" xmlns:wps="http://schemas.microsoft.com/office/word/2010/wordprocessingShape" mc:Ignorable="w14 w15 w16se wp14">
   <w:body>
     <w:p>
       <w:pPr>
@@ -600,8 +600,6 @@
         </w:rPr>
         <w:t>Para las horas trabajadas</w:t>
       </w:r>
-      <w:bookmarkStart w:id="0" w:name="_GoBack"/>
-      <w:bookmarkEnd w:id="0"/>
       <w:r>
         <w:rPr>
           <w:lang w:val="es-MX"/>
@@ -634,46 +632,20 @@
         <w:rPr>
           <w:lang w:val="es-MX"/>
         </w:rPr>
-        <w:t xml:space="preserve">Rocío me va a pasar la lista. Crear un reporte con </w:t>
-      </w:r>
-      <w:proofErr w:type="spellStart"/>
-      <w:r>
-        <w:rPr>
-          <w:lang w:val="es-MX"/>
-        </w:rPr>
-        <w:t>table</w:t>
-      </w:r>
-      <w:proofErr w:type="spellEnd"/>
-      <w:r>
-        <w:rPr>
-          <w:lang w:val="es-MX"/>
-        </w:rPr>
-        <w:t xml:space="preserve"> semanal de ventas</w:t>
-      </w:r>
-      <w:r>
-        <w:rPr>
-          <w:lang w:val="es-MX"/>
-        </w:rPr>
-        <w:t>.</w:t>
-      </w:r>
-    </w:p>
-    <w:p>
-      <w:pPr>
-        <w:rPr>
-          <w:lang w:val="es-MX"/>
-        </w:rPr>
-      </w:pPr>
-      <w:r>
-        <w:rPr>
-          <w:lang w:val="es-MX"/>
-        </w:rPr>
-        <w:t>Tienen que ser de los proveedores:</w:t>
-      </w:r>
-      <w:r>
-        <w:rPr>
-          <w:lang w:val="es-MX"/>
-        </w:rPr>
-        <w:br/>
+        <w:t>Serían las mismas dos solapas SKU, Familias y Modelos</w:t>
+      </w:r>
+    </w:p>
+    <w:p>
+      <w:pPr>
+        <w:rPr>
+          <w:lang w:val="es-MX"/>
+        </w:rPr>
+      </w:pPr>
+      <w:r>
+        <w:rPr>
+          <w:lang w:val="es-MX"/>
+        </w:rPr>
+        <w:t>Para los siguientes proveedores y más artículos seleccionados en archivo:</w:t>
       </w:r>
     </w:p>
     <w:tbl>
@@ -832,6 +804,7 @@
                 <w:szCs w:val="20"/>
               </w:rPr>
             </w:pPr>
+            <w:bookmarkStart w:id="0" w:name="_GoBack"/>
             <w:r>
               <w:rPr>
                 <w:rFonts w:ascii="Arial" w:eastAsia="Times New Roman" w:hAnsi="Arial" w:cs="Arial"/>
@@ -841,6 +814,7 @@
               </w:rPr>
               <w:t>CDEI</w:t>
             </w:r>
+            <w:bookmarkEnd w:id="0"/>
           </w:p>
         </w:tc>
       </w:tr>
@@ -856,39 +830,6 @@
           <w:lang w:val="es-MX"/>
         </w:rPr>
         <w:t xml:space="preserve"> </w:t>
-      </w:r>
-    </w:p>
-    <w:p>
-      <w:pPr>
-        <w:rPr>
-          <w:lang w:val="es-MX"/>
-        </w:rPr>
-      </w:pPr>
-      <w:r>
-        <w:rPr>
-          <w:lang w:val="es-MX"/>
-        </w:rPr>
-        <w:t>Más algunos artículos puntuales de otros proveedores.</w:t>
-      </w:r>
-    </w:p>
-    <w:p>
-      <w:pPr>
-        <w:rPr>
-          <w:lang w:val="es-MX"/>
-        </w:rPr>
-      </w:pPr>
-    </w:p>
-    <w:p>
-      <w:pPr>
-        <w:rPr>
-          <w:lang w:val="es-MX"/>
-        </w:rPr>
-      </w:pPr>
-      <w:r>
-        <w:rPr>
-          <w:lang w:val="es-MX"/>
-        </w:rPr>
-        <w:t>Serían las mismas dos solapas SKU, Familias y Modelos</w:t>
       </w:r>
     </w:p>
     <w:p>

</xml_diff>

<commit_message>
nuevo reporte de joyería acumulada en proceso
</commit_message>
<xml_diff>
--- a/Cambios a Reportes.docx
+++ b/Cambios a Reportes.docx
@@ -385,29 +385,33 @@
     <w:p>
       <w:pPr>
         <w:rPr>
-          <w:lang w:val="es-MX"/>
-        </w:rPr>
-      </w:pPr>
-      <w:r>
-        <w:rPr>
+          <w:lang w:val="es-AR"/>
+        </w:rPr>
+      </w:pPr>
+      <w:r>
+        <w:rPr>
+          <w:highlight w:val="green"/>
           <w:lang w:val="es-MX"/>
         </w:rPr>
         <w:t>Incentivo (sueldos)</w:t>
       </w:r>
       <w:r>
         <w:rPr>
+          <w:highlight w:val="green"/>
           <w:lang w:val="es-MX"/>
         </w:rPr>
         <w:t>: llamarlo Premio x venta y una parte sale de los recibos de sueldo. La otra parte pedir a Silvina (</w:t>
       </w:r>
       <w:r>
         <w:rPr>
+          <w:highlight w:val="green"/>
           <w:lang w:val="es-MX"/>
         </w:rPr>
         <w:t>lo que se paga por afuera a las encargadas, no supervisoras)</w:t>
       </w:r>
       <w:r>
         <w:rPr>
+          <w:highlight w:val="green"/>
           <w:lang w:val="es-MX"/>
         </w:rPr>
         <w:t xml:space="preserve"> SUMAR ESTO AL </w:t>
@@ -415,12 +419,14 @@
       <w:r>
         <w:rPr>
           <w:b/>
+          <w:highlight w:val="green"/>
           <w:lang w:val="es-MX"/>
         </w:rPr>
         <w:t>REPORTE DE GASTOS</w:t>
       </w:r>
       <w:r>
         <w:rPr>
+          <w:highlight w:val="green"/>
           <w:lang w:val="es-MX"/>
         </w:rPr>
         <w:t xml:space="preserve"> (DISCRIMINANDO INCENTIVO DE SUELDO)</w:t>
@@ -498,6 +504,7 @@
       </w:pPr>
       <w:r>
         <w:rPr>
+          <w:highlight w:val="green"/>
           <w:lang w:val="es-MX"/>
         </w:rPr>
         <w:t xml:space="preserve">Agregar tabla de % ventas x medio de pago (ver si con </w:t>
@@ -505,6 +512,7 @@
       <w:proofErr w:type="spellStart"/>
       <w:r>
         <w:rPr>
+          <w:highlight w:val="green"/>
           <w:lang w:val="es-MX"/>
         </w:rPr>
         <w:t>ODoo</w:t>
@@ -512,6 +520,7 @@
       <w:proofErr w:type="spellEnd"/>
       <w:r>
         <w:rPr>
+          <w:highlight w:val="green"/>
           <w:lang w:val="es-MX"/>
         </w:rPr>
         <w:t xml:space="preserve"> o con </w:t>
@@ -519,6 +528,7 @@
       <w:proofErr w:type="spellStart"/>
       <w:r>
         <w:rPr>
+          <w:highlight w:val="green"/>
           <w:lang w:val="es-MX"/>
         </w:rPr>
         <w:t>fiserv</w:t>
@@ -526,6 +536,7 @@
       <w:proofErr w:type="spellEnd"/>
       <w:r>
         <w:rPr>
+          <w:highlight w:val="green"/>
           <w:lang w:val="es-MX"/>
         </w:rPr>
         <w:t>)</w:t>
@@ -625,11 +636,13 @@
     <w:p>
       <w:pPr>
         <w:rPr>
-          <w:lang w:val="es-MX"/>
-        </w:rPr>
-      </w:pPr>
-      <w:r>
-        <w:rPr>
+          <w:highlight w:val="green"/>
+          <w:lang w:val="es-MX"/>
+        </w:rPr>
+      </w:pPr>
+      <w:r>
+        <w:rPr>
+          <w:highlight w:val="green"/>
           <w:lang w:val="es-MX"/>
         </w:rPr>
         <w:t>Serían las mismas dos solapas SKU, Familias y Modelos</w:t>
@@ -638,11 +651,13 @@
     <w:p>
       <w:pPr>
         <w:rPr>
-          <w:lang w:val="es-MX"/>
-        </w:rPr>
-      </w:pPr>
-      <w:r>
-        <w:rPr>
+          <w:highlight w:val="green"/>
+          <w:lang w:val="es-MX"/>
+        </w:rPr>
+      </w:pPr>
+      <w:r>
+        <w:rPr>
+          <w:highlight w:val="green"/>
           <w:lang w:val="es-MX"/>
         </w:rPr>
         <w:t>Para los siguientes proveedores y más artículos seleccionados en archivo:</w:t>
@@ -682,6 +697,7 @@
                 <w:color w:val="000000"/>
                 <w:sz w:val="20"/>
                 <w:szCs w:val="20"/>
+                <w:highlight w:val="green"/>
               </w:rPr>
             </w:pPr>
             <w:r>
@@ -690,8 +706,93 @@
                 <w:color w:val="000000"/>
                 <w:sz w:val="20"/>
                 <w:szCs w:val="20"/>
+                <w:highlight w:val="green"/>
               </w:rPr>
               <w:t>FABIAN BILAVSKY</w:t>
+            </w:r>
+          </w:p>
+        </w:tc>
+      </w:tr>
+      <w:tr>
+        <w:trPr>
+          <w:trHeight w:val="290"/>
+        </w:trPr>
+        <w:tc>
+          <w:tcPr>
+            <w:tcW w:w="3940" w:type="dxa"/>
+            <w:tcBorders>
+              <w:top w:val="nil"/>
+              <w:left w:val="single" w:sz="4" w:space="0" w:color="DEE2E6"/>
+              <w:bottom w:val="single" w:sz="4" w:space="0" w:color="DEE2E6"/>
+              <w:right w:val="single" w:sz="4" w:space="0" w:color="DEE2E6"/>
+            </w:tcBorders>
+            <w:shd w:val="clear" w:color="auto" w:fill="auto"/>
+            <w:noWrap/>
+            <w:vAlign w:val="bottom"/>
+            <w:hideMark/>
+          </w:tcPr>
+          <w:p>
+            <w:pPr>
+              <w:spacing w:after="0" w:line="240" w:lineRule="auto"/>
+              <w:rPr>
+                <w:rFonts w:ascii="Arial" w:eastAsia="Times New Roman" w:hAnsi="Arial" w:cs="Arial"/>
+                <w:color w:val="000000"/>
+                <w:sz w:val="20"/>
+                <w:szCs w:val="20"/>
+                <w:highlight w:val="green"/>
+              </w:rPr>
+            </w:pPr>
+            <w:r>
+              <w:rPr>
+                <w:rFonts w:ascii="Arial" w:eastAsia="Times New Roman" w:hAnsi="Arial" w:cs="Arial"/>
+                <w:color w:val="000000"/>
+                <w:sz w:val="20"/>
+                <w:szCs w:val="20"/>
+                <w:highlight w:val="green"/>
+              </w:rPr>
+              <w:t>VICTOR BERENGARD</w:t>
+            </w:r>
+          </w:p>
+        </w:tc>
+      </w:tr>
+      <w:tr>
+        <w:trPr>
+          <w:trHeight w:val="290"/>
+        </w:trPr>
+        <w:tc>
+          <w:tcPr>
+            <w:tcW w:w="3940" w:type="dxa"/>
+            <w:tcBorders>
+              <w:top w:val="nil"/>
+              <w:left w:val="single" w:sz="4" w:space="0" w:color="DEE2E6"/>
+              <w:bottom w:val="single" w:sz="4" w:space="0" w:color="DEE2E6"/>
+              <w:right w:val="single" w:sz="4" w:space="0" w:color="DEE2E6"/>
+            </w:tcBorders>
+            <w:shd w:val="clear" w:color="auto" w:fill="auto"/>
+            <w:noWrap/>
+            <w:vAlign w:val="bottom"/>
+            <w:hideMark/>
+          </w:tcPr>
+          <w:p>
+            <w:pPr>
+              <w:spacing w:after="0" w:line="240" w:lineRule="auto"/>
+              <w:rPr>
+                <w:rFonts w:ascii="Arial" w:eastAsia="Times New Roman" w:hAnsi="Arial" w:cs="Arial"/>
+                <w:color w:val="000000"/>
+                <w:sz w:val="20"/>
+                <w:szCs w:val="20"/>
+                <w:highlight w:val="green"/>
+              </w:rPr>
+            </w:pPr>
+            <w:r>
+              <w:rPr>
+                <w:rFonts w:ascii="Arial" w:eastAsia="Times New Roman" w:hAnsi="Arial" w:cs="Arial"/>
+                <w:color w:val="000000"/>
+                <w:sz w:val="20"/>
+                <w:szCs w:val="20"/>
+                <w:highlight w:val="green"/>
+              </w:rPr>
+              <w:t>NORBERTO KORDICH</w:t>
             </w:r>
           </w:p>
         </w:tc>
@@ -730,94 +831,13 @@
                 <w:color w:val="000000"/>
                 <w:sz w:val="20"/>
                 <w:szCs w:val="20"/>
+                <w:highlight w:val="green"/>
               </w:rPr>
-              <w:t>VICTOR BERENGARD</w:t>
+              <w:t>CDEI</w:t>
             </w:r>
           </w:p>
         </w:tc>
       </w:tr>
-      <w:tr>
-        <w:trPr>
-          <w:trHeight w:val="290"/>
-        </w:trPr>
-        <w:tc>
-          <w:tcPr>
-            <w:tcW w:w="3940" w:type="dxa"/>
-            <w:tcBorders>
-              <w:top w:val="nil"/>
-              <w:left w:val="single" w:sz="4" w:space="0" w:color="DEE2E6"/>
-              <w:bottom w:val="single" w:sz="4" w:space="0" w:color="DEE2E6"/>
-              <w:right w:val="single" w:sz="4" w:space="0" w:color="DEE2E6"/>
-            </w:tcBorders>
-            <w:shd w:val="clear" w:color="auto" w:fill="auto"/>
-            <w:noWrap/>
-            <w:vAlign w:val="bottom"/>
-            <w:hideMark/>
-          </w:tcPr>
-          <w:p>
-            <w:pPr>
-              <w:spacing w:after="0" w:line="240" w:lineRule="auto"/>
-              <w:rPr>
-                <w:rFonts w:ascii="Arial" w:eastAsia="Times New Roman" w:hAnsi="Arial" w:cs="Arial"/>
-                <w:color w:val="000000"/>
-                <w:sz w:val="20"/>
-                <w:szCs w:val="20"/>
-              </w:rPr>
-            </w:pPr>
-            <w:r>
-              <w:rPr>
-                <w:rFonts w:ascii="Arial" w:eastAsia="Times New Roman" w:hAnsi="Arial" w:cs="Arial"/>
-                <w:color w:val="000000"/>
-                <w:sz w:val="20"/>
-                <w:szCs w:val="20"/>
-              </w:rPr>
-              <w:t>NORBERTO KORDICH</w:t>
-            </w:r>
-          </w:p>
-        </w:tc>
-      </w:tr>
-      <w:tr>
-        <w:trPr>
-          <w:trHeight w:val="290"/>
-        </w:trPr>
-        <w:tc>
-          <w:tcPr>
-            <w:tcW w:w="3940" w:type="dxa"/>
-            <w:tcBorders>
-              <w:top w:val="nil"/>
-              <w:left w:val="single" w:sz="4" w:space="0" w:color="DEE2E6"/>
-              <w:bottom w:val="single" w:sz="4" w:space="0" w:color="DEE2E6"/>
-              <w:right w:val="single" w:sz="4" w:space="0" w:color="DEE2E6"/>
-            </w:tcBorders>
-            <w:shd w:val="clear" w:color="auto" w:fill="auto"/>
-            <w:noWrap/>
-            <w:vAlign w:val="bottom"/>
-            <w:hideMark/>
-          </w:tcPr>
-          <w:p>
-            <w:pPr>
-              <w:spacing w:after="0" w:line="240" w:lineRule="auto"/>
-              <w:rPr>
-                <w:rFonts w:ascii="Arial" w:eastAsia="Times New Roman" w:hAnsi="Arial" w:cs="Arial"/>
-                <w:color w:val="000000"/>
-                <w:sz w:val="20"/>
-                <w:szCs w:val="20"/>
-              </w:rPr>
-            </w:pPr>
-            <w:bookmarkStart w:id="0" w:name="_GoBack"/>
-            <w:r>
-              <w:rPr>
-                <w:rFonts w:ascii="Arial" w:eastAsia="Times New Roman" w:hAnsi="Arial" w:cs="Arial"/>
-                <w:color w:val="000000"/>
-                <w:sz w:val="20"/>
-                <w:szCs w:val="20"/>
-              </w:rPr>
-              <w:t>CDEI</w:t>
-            </w:r>
-            <w:bookmarkEnd w:id="0"/>
-          </w:p>
-        </w:tc>
-      </w:tr>
     </w:tbl>
     <w:p>
       <w:pPr>
@@ -838,6 +858,21 @@
           <w:lang w:val="es-MX"/>
         </w:rPr>
       </w:pPr>
+      <w:r>
+        <w:rPr>
+          <w:lang w:val="es-MX"/>
+        </w:rPr>
+        <w:t>VER LOS CAMBIOS QUE LE HIZO ROCIO PARA REPRODUCIRLOS EN R.</w:t>
+      </w:r>
+      <w:bookmarkStart w:id="0" w:name="_GoBack"/>
+      <w:bookmarkEnd w:id="0"/>
+    </w:p>
+    <w:p>
+      <w:pPr>
+        <w:rPr>
+          <w:lang w:val="es-MX"/>
+        </w:rPr>
+      </w:pPr>
     </w:p>
     <w:p>
       <w:pPr>
@@ -851,6 +886,20 @@
         </w:rPr>
         <w:t>COMMIT</w:t>
       </w:r>
+    </w:p>
+    <w:p>
+      <w:pPr>
+        <w:rPr>
+          <w:lang w:val="es-MX"/>
+        </w:rPr>
+      </w:pPr>
+    </w:p>
+    <w:p>
+      <w:pPr>
+        <w:rPr>
+          <w:lang w:val="es-MX"/>
+        </w:rPr>
+      </w:pPr>
     </w:p>
     <w:sectPr>
       <w:pgSz w:w="12240" w:h="15840"/>

</xml_diff>